<commit_message>
update doc Marco Agil
</commit_message>
<xml_diff>
--- a/Fase 2/Evidencias Proyecto/Evidencias de documentación/Marco Ágil.docx
+++ b/Fase 2/Evidencias Proyecto/Evidencias de documentación/Marco Ágil.docx
@@ -586,21 +586,6 @@
         </w:p>
       </w:sdtContent>
     </w:sdt>
-    <w:p>
-      <w:r>
-        <w:lastRenderedPageBreak/>
-        <w:fldChar w:fldCharType="begin"/>
-      </w:r>
-      <w:r>
-        <w:instrText xml:space="preserve"> INDEX \c "2" \z "13322" </w:instrText>
-      </w:r>
-      <w:r>
-        <w:fldChar w:fldCharType="separate"/>
-      </w:r>
-      <w:r>
-        <w:fldChar w:fldCharType="end"/>
-      </w:r>
-    </w:p>
     <w:p/>
     <w:p/>
     <w:p/>
@@ -623,44 +608,48 @@
     <w:p/>
     <w:p/>
     <w:p/>
-    <w:p/>
     <w:p>
       <w:pPr>
         <w:pStyle w:val="Ttulo1"/>
-      </w:pPr>
-      <w:r>
-        <w:lastRenderedPageBreak/>
-        <w:t>Product Vision</w:t>
-      </w:r>
-    </w:p>
-    <w:p>
-      <w:pPr>
-        <w:ind w:firstLine="708"/>
+        <w:numPr>
+          <w:ilvl w:val="0"/>
+          <w:numId w:val="25"/>
+        </w:numPr>
         <w:rPr>
           <w:b/>
           <w:bCs/>
         </w:rPr>
       </w:pPr>
+      <w:r>
+        <w:lastRenderedPageBreak/>
+        <w:t>Visión del Producto e Innovación</w:t>
+      </w:r>
     </w:p>
     <w:p>
       <w:pPr>
         <w:pStyle w:val="Ttulo2"/>
       </w:pPr>
       <w:r>
-        <w:t>1. Introducción y Contexto del Mercado</w:t>
-      </w:r>
-    </w:p>
-    <w:p>
-      <w:r>
-        <w:t xml:space="preserve">El comercio electrónico en Chile ha experimentado un crecimiento exponencial en la última década, consolidando infraestructuras orientadas casi en su totalidad al </w:t>
-      </w:r>
-      <w:proofErr w:type="spellStart"/>
-      <w:r>
-        <w:t>retail</w:t>
-      </w:r>
-      <w:proofErr w:type="spellEnd"/>
-      <w:r>
-        <w:t xml:space="preserve"> estandarizado y al consumo masivo. Sin embargo, el mercado de compraventa entre particulares y la comercialización de productos independientes ha quedado rezagado. Ante la falta de plataformas especializadas que ofrezcan condiciones justas, los métodos de venta informal para creadores, coleccionistas y microempresarios se han volcado masivamente a las redes sociales (como Instagram o grupos de Facebook).</w:t>
+        <w:t>1. Product Vision</w:t>
+      </w:r>
+    </w:p>
+    <w:p>
+      <w:pPr>
+        <w:pStyle w:val="Ttulo3"/>
+      </w:pPr>
+      <w:r>
+        <w:t>1.</w:t>
+      </w:r>
+      <w:r>
+        <w:t>1</w:t>
+      </w:r>
+      <w:r>
+        <w:t>Introducción y Contexto del Mercado</w:t>
+      </w:r>
+    </w:p>
+    <w:p>
+      <w:r>
+        <w:t>El comercio electrónico en Chile ha experimentado un crecimiento exponencial en la última década, consolidando infraestructuras orientadas casi en su totalidad al retail estandarizado y al consumo masivo. Sin embargo, el mercado de compraventa entre particulares y la comercialización de productos independientes ha quedado rezagado. Ante la falta de plataformas especializadas que ofrezcan condiciones justas, los métodos de venta informal para creadores, coleccionistas y microempresarios se han volcado masivamente a las redes sociales (como Instagram o grupos de Facebook).</w:t>
       </w:r>
     </w:p>
     <w:p>
@@ -670,10 +659,19 @@
     </w:p>
     <w:p>
       <w:pPr>
-        <w:pStyle w:val="Ttulo2"/>
-      </w:pPr>
-      <w:r>
-        <w:t>2. El Problema a Resolver</w:t>
+        <w:pStyle w:val="Ttulo3"/>
+      </w:pPr>
+      <w:r>
+        <w:t>1</w:t>
+      </w:r>
+      <w:r>
+        <w:t>.</w:t>
+      </w:r>
+      <w:r>
+        <w:t>2</w:t>
+      </w:r>
+      <w:r>
+        <w:t xml:space="preserve"> El Problema a Resolver</w:t>
       </w:r>
     </w:p>
     <w:p>
@@ -744,10 +742,13 @@
     </w:p>
     <w:p>
       <w:pPr>
-        <w:pStyle w:val="Ttulo2"/>
-      </w:pPr>
-      <w:r>
-        <w:t>3. Perfiles de Usuario (A quién va dirigido)</w:t>
+        <w:pStyle w:val="Ttulo3"/>
+      </w:pPr>
+      <w:r>
+        <w:t>1.3</w:t>
+      </w:r>
+      <w:r>
+        <w:t>. Perfiles de Usuario (A quién va dirigido)</w:t>
       </w:r>
     </w:p>
     <w:p>
@@ -788,23 +789,24 @@
         <w:t>Compradores y Coleccionistas Digitales:</w:t>
       </w:r>
       <w:r>
-        <w:t xml:space="preserve"> Usuarios habituados al entorno digital que buscan adquirir artículos originales, únicos o participar en pujas competitivas. Desean una experiencia </w:t>
-      </w:r>
-      <w:proofErr w:type="spellStart"/>
-      <w:r>
-        <w:t>gamificada</w:t>
-      </w:r>
-      <w:proofErr w:type="spellEnd"/>
-      <w:r>
-        <w:t xml:space="preserve"> y emocionante, pero su principal barrera de entrada actual es el temor al fraude. Requieren una plataforma que les garantice que su dinero está protegido y que los vendedores han sido verificados.</w:t>
-      </w:r>
-    </w:p>
-    <w:p>
-      <w:pPr>
-        <w:pStyle w:val="Ttulo2"/>
-      </w:pPr>
-      <w:r>
-        <w:t>4. La Solución: ¿Qué es Vindex?</w:t>
+        <w:t xml:space="preserve"> Usuarios habituados al entorno digital que buscan adquirir artículos originales, únicos o participar en pujas competitivas. Desean una experiencia gamificada y emocionante, pero su principal barrera de entrada actual es el temor al fraude. Requieren una plataforma que les garantice que su dinero está protegido y que los vendedores han sido verificados.</w:t>
+      </w:r>
+    </w:p>
+    <w:p>
+      <w:pPr>
+        <w:pStyle w:val="Ttulo3"/>
+      </w:pPr>
+      <w:r>
+        <w:t>1</w:t>
+      </w:r>
+      <w:r>
+        <w:t>.</w:t>
+      </w:r>
+      <w:r>
+        <w:t>4</w:t>
+      </w:r>
+      <w:r>
+        <w:t xml:space="preserve"> La Solución: ¿Qué es Vindex?</w:t>
       </w:r>
     </w:p>
     <w:p>
@@ -882,10 +884,19 @@
     </w:p>
     <w:p>
       <w:pPr>
-        <w:pStyle w:val="Ttulo2"/>
-      </w:pPr>
-      <w:r>
-        <w:t>5. Propuesta de Valor y Diferenciadores</w:t>
+        <w:pStyle w:val="Ttulo3"/>
+      </w:pPr>
+      <w:r>
+        <w:t>1</w:t>
+      </w:r>
+      <w:r>
+        <w:t>.</w:t>
+      </w:r>
+      <w:r>
+        <w:t>5</w:t>
+      </w:r>
+      <w:r>
+        <w:t xml:space="preserve"> Propuesta de Valor y Diferenciadores</w:t>
       </w:r>
     </w:p>
     <w:p>
@@ -905,15 +916,7 @@
     </w:p>
     <w:p>
       <w:r>
-        <w:t xml:space="preserve">Además, Vindex transforma el estrés de la venta informal en una experiencia segura y garantizada. El modelo híbrido que combina la venta directa con un motor de subastas </w:t>
-      </w:r>
-      <w:proofErr w:type="spellStart"/>
-      <w:r>
-        <w:t>gamifica</w:t>
-      </w:r>
-      <w:proofErr w:type="spellEnd"/>
-      <w:r>
-        <w:t xml:space="preserve"> la experiencia de compra, aumentando la retención de usuarios. Por su parte, la articulación del pago en custodia (Escrow) con la validación física mediante códigos dinámicos (OTP) crea un entorno de "Cero Riesgo" o </w:t>
+        <w:t xml:space="preserve">Además, Vindex transforma el estrés de la venta informal en una experiencia segura y garantizada. El modelo híbrido que combina la venta directa con un motor de subastas gamifica la experiencia de compra, aumentando la retención de usuarios. Por su parte, la articulación del pago en custodia (Escrow) con la validación física mediante códigos dinámicos (OTP) crea un entorno de "Cero Riesgo" o </w:t>
       </w:r>
       <w:r>
         <w:rPr>
@@ -928,21 +931,316 @@
     </w:p>
     <w:p>
       <w:pPr>
+        <w:pStyle w:val="Ttulo3"/>
+      </w:pPr>
+      <w:r>
+        <w:t>1</w:t>
+      </w:r>
+      <w:r>
+        <w:t>.</w:t>
+      </w:r>
+      <w:r>
+        <w:t>6</w:t>
+      </w:r>
+      <w:r>
+        <w:t xml:space="preserve"> Visión a Futuro e Impacto</w:t>
+      </w:r>
+    </w:p>
+    <w:p>
+      <w:r>
+        <w:t>La visión a largo plazo de Vindex es convertirse en el estándar nacional para transacciones C2C seguras y subastas de artículos independientes en Chile, fomentando la economía creativa local. A nivel tecnológico, el proyecto demuestra cómo arquitecturas modernas (Monolitos Modulares, WebSockets, bases de datos en memoria y flujos transaccionales estrictos) pueden ser orquestadas para resolver problemas sociales reales, aportando valor tangible tanto al mercado laboral de la ingeniería de software como al desarrollo económico de los microvendedores del país.</w:t>
+      </w:r>
+    </w:p>
+    <w:p>
+      <w:r>
+        <w:br w:type="page"/>
+      </w:r>
+    </w:p>
+    <w:p/>
+    <w:p>
+      <w:r>
+        <w:br w:type="page"/>
+      </w:r>
+    </w:p>
+    <w:p>
+      <w:pPr>
         <w:pStyle w:val="Ttulo2"/>
       </w:pPr>
       <w:r>
-        <w:t>6. Visión a Futuro e Impacto</w:t>
-      </w:r>
-    </w:p>
-    <w:p>
-      <w:r>
-        <w:t>La visión a largo plazo de Vindex es convertirse en el estándar nacional para transacciones C2C seguras y subastas de artículos independientes en Chile, fomentando la economía creativa local. A nivel tecnológico, el proyecto demuestra cómo arquitecturas modernas (Monolitos Modulares, WebSockets, bases de datos en memoria y flujos transaccionales estrictos) pueden ser orquestadas para resolver problemas sociales reales, aportando valor tangible tanto al mercado laboral de la ingeniería de software como al desarrollo económico de los microvendedores del país.</w:t>
+        <w:lastRenderedPageBreak/>
+        <w:t>1.2. Innovación de la Solución</w:t>
+      </w:r>
+    </w:p>
+    <w:p>
+      <w:r>
+        <w:t xml:space="preserve">El proyecto Vindex ha sido diseñado no solo para cumplir con los estándares técnicos de una plataforma de comercio electrónico tradicional, sino para introducir un modelo de negocio y tecnológico disruptivo en el mercado chileno. A continuación, se detallan los pilares de innovación del sistema respondiendo a las exigencias del proyecto: </w:t>
+      </w:r>
+    </w:p>
+    <w:p>
+      <w:r>
+        <w:rPr>
+          <w:b/>
+          <w:bCs/>
+        </w:rPr>
+        <w:t>¿Qué problema resuelve?</w:t>
+      </w:r>
+      <w:r>
+        <w:t xml:space="preserve"> Vindex aborda tres deficiencias críticas que asfixian actualmente la economía de los creadores independientes, artistas emergentes y microempresarios en el entorno digital: </w:t>
+      </w:r>
+    </w:p>
+    <w:p>
+      <w:pPr>
+        <w:numPr>
+          <w:ilvl w:val="0"/>
+          <w:numId w:val="27"/>
+        </w:numPr>
+      </w:pPr>
+      <w:r>
+        <w:rPr>
+          <w:b/>
+          <w:bCs/>
+        </w:rPr>
+        <w:t>Vulnerabilidad y barreras económicas:</w:t>
+      </w:r>
+      <w:r>
+        <w:t xml:space="preserve"> Los marketplaces intermediarios tradicionales y las plataformas internacionales imponen comisiones abusivas (entre un 20% y un 30%), lo que reduce drásticamente los márgenes de ganancia y hace insostenible la comercialización a pequeña escala. </w:t>
+      </w:r>
+    </w:p>
+    <w:p>
+      <w:pPr>
+        <w:numPr>
+          <w:ilvl w:val="0"/>
+          <w:numId w:val="27"/>
+        </w:numPr>
+      </w:pPr>
+      <w:r>
+        <w:rPr>
+          <w:b/>
+          <w:bCs/>
+        </w:rPr>
+        <w:t>Inflexibilidad en la fijación de precios:</w:t>
+      </w:r>
+      <w:r>
+        <w:t xml:space="preserve"> Los creadores de piezas únicas, arte o artículos de colección de segunda mano carecen de herramientas para determinar el valor real de sus productos en el mercado. El modelo estático de "precio fijo" a menudo genera pérdidas de capital o estancamiento de inventario. </w:t>
+      </w:r>
+    </w:p>
+    <w:p>
+      <w:pPr>
+        <w:numPr>
+          <w:ilvl w:val="0"/>
+          <w:numId w:val="27"/>
+        </w:numPr>
+      </w:pPr>
+      <w:r>
+        <w:rPr>
+          <w:b/>
+          <w:bCs/>
+        </w:rPr>
+        <w:t>Fraude y exposición en la entrega:</w:t>
+      </w:r>
+      <w:r>
+        <w:t xml:space="preserve"> La venta informal canalizada a través de redes sociales carece de trazabilidad y protección financiera. Los compradores se exponen a estafas al transferir dinero por adelantado, mientras que las entregas presenciales sin validación representan un riesgo de seguridad para ambas partes. </w:t>
+      </w:r>
+    </w:p>
+    <w:p>
+      <w:r>
+        <w:rPr>
+          <w:b/>
+          <w:bCs/>
+        </w:rPr>
+        <w:t>¿Qué hace diferente a la solución?</w:t>
+      </w:r>
+    </w:p>
+    <w:p>
+      <w:r>
+        <w:t>La diferenciación técnica y comercial de Vindex radica en la integración de arquitecturas complejas dentro de un mismo ecosistema híbrido:</w:t>
+      </w:r>
+    </w:p>
+    <w:p>
+      <w:pPr>
+        <w:numPr>
+          <w:ilvl w:val="0"/>
+          <w:numId w:val="28"/>
+        </w:numPr>
+      </w:pPr>
+      <w:r>
+        <w:rPr>
+          <w:b/>
+          <w:bCs/>
+        </w:rPr>
+        <w:t>Modelo Comercial Híbrido (Marketplace + Subastas en Vivo):</w:t>
+      </w:r>
+      <w:r>
+        <w:t xml:space="preserve"> A diferencia de las plataformas convencionales, Vindex no obliga al vendedor a elegir un solo canal. Permite mantener un catálogo de venta directa y, simultáneamente, organizar remates asíncronos apoyados por un motor en tiempo real. Este motor utiliza WebSockets (Socket.io) y Redis para sincronizar temporizadores y manejar la concurrencia masiva de pujas en milisegundos, incorporando reglas </w:t>
+      </w:r>
+      <w:r>
+        <w:rPr>
+          <w:i/>
+          <w:iCs/>
+        </w:rPr>
+        <w:t>anti-sniping</w:t>
+      </w:r>
+      <w:r>
+        <w:t xml:space="preserve">. </w:t>
+      </w:r>
+    </w:p>
+    <w:p>
+      <w:pPr>
+        <w:numPr>
+          <w:ilvl w:val="0"/>
+          <w:numId w:val="28"/>
+        </w:numPr>
+      </w:pPr>
+      <w:r>
+        <w:rPr>
+          <w:b/>
+          <w:bCs/>
+        </w:rPr>
+        <w:lastRenderedPageBreak/>
+        <w:t>Modelo de Confianza Cero (</w:t>
+      </w:r>
+      <w:r>
+        <w:rPr>
+          <w:b/>
+          <w:bCs/>
+          <w:i/>
+          <w:iCs/>
+        </w:rPr>
+        <w:t>Trustless</w:t>
+      </w:r>
+      <w:r>
+        <w:rPr>
+          <w:b/>
+          <w:bCs/>
+        </w:rPr>
+        <w:t>) mediante Escrow y OTP:</w:t>
+      </w:r>
+      <w:r>
+        <w:t xml:space="preserve"> Vindex elimina la necesidad de confianza ciega entre usuarios. Introduce un sistema transaccional de pagos en custodia (Escrow) donde el dinero del comprador queda retenido. La principal diferencia tecnológica radica en la validación física: los fondos solo se liberan a la cuenta del vendedor cuando el comprador inspecciona el producto físicamente y dicta un código dinámico de un solo uso (OTP) que el sistema valida en tiempo real. </w:t>
+      </w:r>
+    </w:p>
+    <w:p>
+      <w:r>
+        <w:rPr>
+          <w:b/>
+          <w:bCs/>
+        </w:rPr>
+        <w:t>¿Qué valor agrega?</w:t>
+      </w:r>
+    </w:p>
+    <w:p>
+      <w:r>
+        <w:t>El valor agregado de la plataforma impacta tanto a nivel socioeconómico como tecnológico:</w:t>
+      </w:r>
+    </w:p>
+    <w:p>
+      <w:pPr>
+        <w:numPr>
+          <w:ilvl w:val="0"/>
+          <w:numId w:val="29"/>
+        </w:numPr>
+      </w:pPr>
+      <w:r>
+        <w:rPr>
+          <w:b/>
+          <w:bCs/>
+        </w:rPr>
+        <w:t>Empoderamiento y Rentabilidad:</w:t>
+      </w:r>
+      <w:r>
+        <w:t xml:space="preserve"> Vindex baja las comisiones de intermediación a un rango justo (5% al 10%). Esto permite que los creadores retengan hasta un 25% más de sus utilidades netas, fomentando directamente la economía creativa local. </w:t>
+      </w:r>
+    </w:p>
+    <w:p>
+      <w:pPr>
+        <w:numPr>
+          <w:ilvl w:val="0"/>
+          <w:numId w:val="29"/>
+        </w:numPr>
+      </w:pPr>
+      <w:r>
+        <w:rPr>
+          <w:b/>
+          <w:bCs/>
+        </w:rPr>
+        <w:t>Seguridad Transaccional Absoluta:</w:t>
+      </w:r>
+      <w:r>
+        <w:t xml:space="preserve"> Erradica el riesgo de fraude. El vendedor despacha el producto con la garantía matemática de que los fondos ya han sido capturados por la pasarela, y el comprador paga con la tranquilidad de que su dinero no será transferido si el producto no es entregado conforme. </w:t>
+      </w:r>
+    </w:p>
+    <w:p>
+      <w:pPr>
+        <w:numPr>
+          <w:ilvl w:val="0"/>
+          <w:numId w:val="29"/>
+        </w:numPr>
+      </w:pPr>
+      <w:r>
+        <w:rPr>
+          <w:b/>
+          <w:bCs/>
+        </w:rPr>
+        <w:t>Gamificación del Comercio Digital:</w:t>
+      </w:r>
+      <w:r>
+        <w:t xml:space="preserve"> Transforma el comercio estático en una experiencia interactiva. La sala de subastas en vivo genera un sentido de urgencia y competitividad, aumentando la retención de los usuarios y permitiendo que el mercado autorregule de forma transparente el precio justo de artículos exclusivos.</w:t>
       </w:r>
     </w:p>
     <w:p/>
     <w:p>
       <w:pPr>
         <w:pStyle w:val="Ttulo1"/>
+      </w:pPr>
+      <w:r>
+        <w:t xml:space="preserve">2. </w:t>
+      </w:r>
+      <w:r>
+        <w:t>Gestión Ágil del Proyecto</w:t>
+      </w:r>
+    </w:p>
+    <w:p>
+      <w:pPr>
+        <w:pStyle w:val="Ttulo2"/>
+        <w:rPr>
+          <w:noProof/>
+        </w:rPr>
+      </w:pPr>
+      <w:r>
+        <w:rPr>
+          <w:noProof/>
+        </w:rPr>
+        <w:t>2.</w:t>
+      </w:r>
+      <w:r>
+        <w:rPr>
+          <w:noProof/>
+        </w:rPr>
+        <w:t>1</w:t>
+      </w:r>
+      <w:r>
+        <w:rPr>
+          <w:noProof/>
+        </w:rPr>
+        <w:t xml:space="preserve"> Product Backlog Priorizado (Historias de Usuario)</w:t>
+      </w:r>
+    </w:p>
+    <w:p>
+      <w:pPr>
+        <w:rPr>
+          <w:noProof/>
+        </w:rPr>
+      </w:pPr>
+      <w:r>
+        <w:rPr>
+          <w:noProof/>
+        </w:rPr>
+        <w:t>El siguiente Product Backlog detalla los requerimientos funcionales y técnicos de Vindex. Ha sido priorizado basándose en el valor arquitectónico y de negocio, ordenando los elementos desde la infraestructura base hasta las funcionalidades críticas de concurrencia y seguridad financiera.</w:t>
+      </w:r>
+    </w:p>
+    <w:p>
+      <w:pPr>
+        <w:pStyle w:val="Ttulo3"/>
         <w:rPr>
           <w:noProof/>
         </w:rPr>
@@ -952,39 +1250,12 @@
           <w:noProof/>
         </w:rPr>
         <w:lastRenderedPageBreak/>
-        <w:t>2. Product Backlog Priorizado (Historias de Usuario)</w:t>
-      </w:r>
-    </w:p>
-    <w:p>
-      <w:pPr>
-        <w:rPr>
-          <w:noProof/>
-        </w:rPr>
-      </w:pPr>
-      <w:r>
-        <w:rPr>
-          <w:noProof/>
-        </w:rPr>
-        <w:t>El siguiente Product Backlog detalla los requerimientos funcionales y técnicos de Vindex. Ha sido priorizado basándose en el valor arquitectónico y de negocio, ordenando los elementos desde la infraestructura base hasta las funcionalidades críticas de concurrencia y seguridad financiera.</w:t>
-      </w:r>
-    </w:p>
-    <w:p>
-      <w:pPr>
-        <w:pStyle w:val="Ttulo2"/>
-        <w:rPr>
-          <w:noProof/>
-        </w:rPr>
-      </w:pPr>
-      <w:r>
-        <w:rPr>
-          <w:noProof/>
-        </w:rPr>
         <w:t>Épica 1: Infraestructura y Autenticación Base (Prioridad: Alta)</w:t>
       </w:r>
     </w:p>
     <w:p>
       <w:pPr>
-        <w:pStyle w:val="Ttulo3"/>
+        <w:pStyle w:val="Ttulo4"/>
         <w:rPr>
           <w:noProof/>
         </w:rPr>
@@ -1033,7 +1304,7 @@
     </w:p>
     <w:p>
       <w:pPr>
-        <w:pStyle w:val="Ttulo3"/>
+        <w:pStyle w:val="Ttulo4"/>
         <w:rPr>
           <w:noProof/>
         </w:rPr>
@@ -1084,7 +1355,7 @@
     </w:p>
     <w:p>
       <w:pPr>
-        <w:pStyle w:val="Ttulo3"/>
+        <w:pStyle w:val="Ttulo4"/>
         <w:rPr>
           <w:noProof/>
         </w:rPr>
@@ -1133,7 +1404,7 @@
     </w:p>
     <w:p>
       <w:pPr>
-        <w:pStyle w:val="Ttulo2"/>
+        <w:pStyle w:val="Ttulo3"/>
         <w:rPr>
           <w:noProof/>
         </w:rPr>
@@ -1147,7 +1418,7 @@
     </w:p>
     <w:p>
       <w:pPr>
-        <w:pStyle w:val="Ttulo3"/>
+        <w:pStyle w:val="Ttulo4"/>
         <w:rPr>
           <w:noProof/>
         </w:rPr>
@@ -1198,7 +1469,7 @@
     </w:p>
     <w:p>
       <w:pPr>
-        <w:pStyle w:val="Ttulo3"/>
+        <w:pStyle w:val="Ttulo4"/>
         <w:rPr>
           <w:noProof/>
         </w:rPr>
@@ -1249,16 +1520,15 @@
     </w:p>
     <w:p>
       <w:pPr>
-        <w:pStyle w:val="Ttulo3"/>
-        <w:rPr>
-          <w:noProof/>
-        </w:rPr>
-      </w:pPr>
-      <w:r>
-        <w:rPr>
-          <w:noProof/>
-        </w:rPr>
-        <w:lastRenderedPageBreak/>
+        <w:pStyle w:val="Ttulo4"/>
+        <w:rPr>
+          <w:noProof/>
+        </w:rPr>
+      </w:pPr>
+      <w:r>
+        <w:rPr>
+          <w:noProof/>
+        </w:rPr>
         <w:t>US-06: Control de Stock Concurrente</w:t>
       </w:r>
     </w:p>
@@ -1301,7 +1571,7 @@
     </w:p>
     <w:p>
       <w:pPr>
-        <w:pStyle w:val="Ttulo2"/>
+        <w:pStyle w:val="Ttulo3"/>
         <w:rPr>
           <w:noProof/>
         </w:rPr>
@@ -1315,7 +1585,7 @@
     </w:p>
     <w:p>
       <w:pPr>
-        <w:pStyle w:val="Ttulo3"/>
+        <w:pStyle w:val="Ttulo4"/>
         <w:rPr>
           <w:noProof/>
         </w:rPr>
@@ -1364,15 +1634,16 @@
     </w:p>
     <w:p>
       <w:pPr>
-        <w:pStyle w:val="Ttulo3"/>
-        <w:rPr>
-          <w:noProof/>
-        </w:rPr>
-      </w:pPr>
-      <w:r>
-        <w:rPr>
-          <w:noProof/>
-        </w:rPr>
+        <w:pStyle w:val="Ttulo4"/>
+        <w:rPr>
+          <w:noProof/>
+        </w:rPr>
+      </w:pPr>
+      <w:r>
+        <w:rPr>
+          <w:noProof/>
+        </w:rPr>
+        <w:lastRenderedPageBreak/>
         <w:t>US-08: Sala de Subastas y Sincronización</w:t>
       </w:r>
     </w:p>
@@ -1413,10 +1684,7 @@
     </w:p>
     <w:p>
       <w:pPr>
-        <w:numPr>
-          <w:ilvl w:val="0"/>
-          <w:numId w:val="11"/>
-        </w:numPr>
+        <w:pStyle w:val="Ttulo4"/>
         <w:rPr>
           <w:b/>
           <w:bCs/>
@@ -1475,7 +1743,7 @@
     </w:p>
     <w:p>
       <w:pPr>
-        <w:pStyle w:val="Ttulo3"/>
+        <w:pStyle w:val="Ttulo4"/>
         <w:rPr>
           <w:noProof/>
         </w:rPr>
@@ -1524,7 +1792,7 @@
     </w:p>
     <w:p>
       <w:pPr>
-        <w:pStyle w:val="Ttulo2"/>
+        <w:pStyle w:val="Ttulo3"/>
         <w:rPr>
           <w:noProof/>
         </w:rPr>
@@ -1538,7 +1806,7 @@
     </w:p>
     <w:p>
       <w:pPr>
-        <w:pStyle w:val="Ttulo3"/>
+        <w:pStyle w:val="Ttulo4"/>
         <w:rPr>
           <w:noProof/>
         </w:rPr>
@@ -1587,16 +1855,15 @@
     </w:p>
     <w:p>
       <w:pPr>
-        <w:pStyle w:val="Ttulo3"/>
-        <w:rPr>
-          <w:noProof/>
-        </w:rPr>
-      </w:pPr>
-      <w:r>
-        <w:rPr>
-          <w:noProof/>
-        </w:rPr>
-        <w:lastRenderedPageBreak/>
+        <w:pStyle w:val="Ttulo4"/>
+        <w:rPr>
+          <w:noProof/>
+        </w:rPr>
+      </w:pPr>
+      <w:r>
+        <w:rPr>
+          <w:noProof/>
+        </w:rPr>
         <w:t>US-12: Generación de Código Dinámico (OTP)</w:t>
       </w:r>
     </w:p>
@@ -1639,7 +1906,7 @@
     </w:p>
     <w:p>
       <w:pPr>
-        <w:pStyle w:val="Ttulo3"/>
+        <w:pStyle w:val="Ttulo4"/>
         <w:rPr>
           <w:noProof/>
         </w:rPr>
@@ -1688,7 +1955,7 @@
     </w:p>
     <w:p>
       <w:pPr>
-        <w:pStyle w:val="Ttulo2"/>
+        <w:pStyle w:val="Ttulo3"/>
         <w:rPr>
           <w:noProof/>
         </w:rPr>
@@ -1702,7 +1969,7 @@
     </w:p>
     <w:p>
       <w:pPr>
-        <w:pStyle w:val="Ttulo3"/>
+        <w:pStyle w:val="Ttulo4"/>
         <w:rPr>
           <w:noProof/>
         </w:rPr>
@@ -1753,15 +2020,16 @@
     </w:p>
     <w:p>
       <w:pPr>
-        <w:pStyle w:val="Ttulo3"/>
-        <w:rPr>
-          <w:noProof/>
-        </w:rPr>
-      </w:pPr>
-      <w:r>
-        <w:rPr>
-          <w:noProof/>
-        </w:rPr>
+        <w:pStyle w:val="Ttulo4"/>
+        <w:rPr>
+          <w:noProof/>
+        </w:rPr>
+      </w:pPr>
+      <w:r>
+        <w:rPr>
+          <w:noProof/>
+        </w:rPr>
+        <w:lastRenderedPageBreak/>
         <w:t>US-15: Sistema de Alertas y Notificaciones</w:t>
       </w:r>
     </w:p>
@@ -1811,7 +2079,25 @@
         <w:rPr>
           <w:noProof/>
         </w:rPr>
-        <w:t>3. Sprint Backlog (Desarrollo por Iteración)</w:t>
+        <w:t>2</w:t>
+      </w:r>
+      <w:r>
+        <w:rPr>
+          <w:noProof/>
+        </w:rPr>
+        <w:t>.</w:t>
+      </w:r>
+      <w:r>
+        <w:rPr>
+          <w:noProof/>
+        </w:rPr>
+        <w:t>2.</w:t>
+      </w:r>
+      <w:r>
+        <w:rPr>
+          <w:noProof/>
+        </w:rPr>
+        <w:t xml:space="preserve"> Sprint Backlog (Desarrollo por Iteración)</w:t>
       </w:r>
     </w:p>
     <w:p>
@@ -1937,7 +2223,6 @@
         <w:rPr>
           <w:noProof/>
         </w:rPr>
-        <w:lastRenderedPageBreak/>
         <w:t>Setup inicial del servicio de caché y pub/sub utilizando Redis.</w:t>
       </w:r>
     </w:p>
@@ -2038,6 +2323,7 @@
         <w:rPr>
           <w:noProof/>
         </w:rPr>
+        <w:lastRenderedPageBreak/>
         <w:t>Sprint 3: Carrito e Inventario (Semanas 5 - 6)</w:t>
       </w:r>
     </w:p>
@@ -2195,7 +2481,6 @@
         <w:rPr>
           <w:noProof/>
         </w:rPr>
-        <w:lastRenderedPageBreak/>
         <w:t>Sprint 5: Tiempo Real y WebSockets (Semanas 9 - 10)</w:t>
       </w:r>
     </w:p>
@@ -2337,6 +2622,7 @@
         <w:rPr>
           <w:noProof/>
         </w:rPr>
+        <w:lastRenderedPageBreak/>
         <w:t>[US-11] Integración de la pasarela de pago (Mercado Pago / Stripe en entorno Sandbox) con soporte para retención de fondos (Escrow).</w:t>
       </w:r>
     </w:p>
@@ -2492,7 +2778,6 @@
         <w:rPr>
           <w:noProof/>
         </w:rPr>
-        <w:lastRenderedPageBreak/>
         <w:t>Ejecución de pruebas de estrés (benchmarking) específicas sobre el gateway de WebSockets para simular alta concurrencia en subastas.</w:t>
       </w:r>
     </w:p>
@@ -2558,7 +2843,13 @@
         <w:rPr>
           <w:noProof/>
         </w:rPr>
-        <w:t>4. Definition of Done (Criterios de Aceptación)</w:t>
+        <w:t>2.3</w:t>
+      </w:r>
+      <w:r>
+        <w:rPr>
+          <w:noProof/>
+        </w:rPr>
+        <w:t>. Definition of Done (Criterios de Aceptación)</w:t>
       </w:r>
     </w:p>
     <w:p>
@@ -2595,6 +2886,7 @@
         <w:rPr>
           <w:noProof/>
         </w:rPr>
+        <w:lastRenderedPageBreak/>
         <w:t>4.1 Definición de Terminado Global (DoD)</w:t>
       </w:r>
     </w:p>
@@ -2735,7 +3027,6 @@
         <w:rPr>
           <w:noProof/>
         </w:rPr>
-        <w:lastRenderedPageBreak/>
         <w:t>4.2 Ejemplos de Criterios de Aceptación por Funcionalidad Clave</w:t>
       </w:r>
     </w:p>
@@ -2827,6 +3118,7 @@
         <w:rPr>
           <w:noProof/>
         </w:rPr>
+        <w:lastRenderedPageBreak/>
         <w:t>Para la Historia de Usuario de Pagos en Custodia (Escrow) y OTP:</w:t>
       </w:r>
     </w:p>
@@ -2883,16 +3175,84 @@
     </w:p>
     <w:p>
       <w:pPr>
-        <w:rPr>
-          <w:b/>
-          <w:bCs/>
-          <w:noProof/>
-          <w:lang w:val="es-ES"/>
-        </w:rPr>
-      </w:pPr>
-    </w:p>
+        <w:pStyle w:val="Ttulo1"/>
+        <w:numPr>
+          <w:ilvl w:val="1"/>
+          <w:numId w:val="30"/>
+        </w:numPr>
+        <w:rPr>
+          <w:noProof/>
+        </w:rPr>
+      </w:pPr>
+      <w:commentRangeStart w:id="0"/>
+      <w:r>
+        <w:rPr>
+          <w:noProof/>
+        </w:rPr>
+        <w:t>Evidencia de Retrospectivas</w:t>
+      </w:r>
+      <w:commentRangeEnd w:id="0"/>
+      <w:r>
+        <w:rPr>
+          <w:rStyle w:val="Refdecomentario"/>
+          <w:noProof/>
+          <w:sz w:val="40"/>
+          <w:szCs w:val="40"/>
+        </w:rPr>
+        <w:commentReference w:id="0"/>
+      </w:r>
+    </w:p>
+    <w:p/>
+    <w:p/>
+    <w:p/>
+    <w:p>
+      <w:pPr>
+        <w:pStyle w:val="Ttulo1"/>
+      </w:pPr>
+      <w:commentRangeStart w:id="1"/>
+      <w:r>
+        <w:t>3. Diagramas</w:t>
+      </w:r>
+      <w:r>
+        <w:t xml:space="preserve"> UML</w:t>
+      </w:r>
+    </w:p>
+    <w:p>
+      <w:pPr>
+        <w:pStyle w:val="Ttulo2"/>
+      </w:pPr>
+      <w:r>
+        <w:t>3.1 Diagrama de Casos de Uso</w:t>
+      </w:r>
+    </w:p>
+    <w:p>
+      <w:pPr>
+        <w:pStyle w:val="Ttulo2"/>
+      </w:pPr>
+      <w:r>
+        <w:t>3.2 Diagrama de Secuencia (Funcionalidad Principal: Pago Escrow y Validación OTP)</w:t>
+      </w:r>
+    </w:p>
+    <w:p>
+      <w:pPr>
+        <w:pStyle w:val="Ttulo2"/>
+      </w:pPr>
+      <w:r>
+        <w:t>3.3 Diagrama de Componentes</w:t>
+      </w:r>
+      <w:commentRangeEnd w:id="1"/>
+      <w:r>
+        <w:rPr>
+          <w:rStyle w:val="Refdecomentario"/>
+          <w:sz w:val="32"/>
+          <w:szCs w:val="32"/>
+        </w:rPr>
+        <w:commentReference w:id="1"/>
+      </w:r>
+    </w:p>
+    <w:p/>
     <w:sectPr>
-      <w:footerReference w:type="default" r:id="rId9"/>
+      <w:footerReference w:type="default" r:id="rId13"/>
       <w:pgSz w:w="12240" w:h="15840"/>
       <w:pgMar w:top="1417" w:right="1701" w:bottom="1417" w:left="1701" w:header="708" w:footer="708" w:gutter="0"/>
       <w:pgNumType w:start="0"/>
@@ -2902,6 +3262,64 @@
     </w:sectPr>
   </w:body>
 </w:document>
+</file>
+
+<file path=word/comments.xml><?xml version="1.0" encoding="utf-8"?>
+<w:comments xmlns:wpc="http://schemas.microsoft.com/office/word/2010/wordprocessingCanvas" xmlns:cx="http://schemas.microsoft.com/office/drawing/2014/chartex" xmlns:cx1="http://schemas.microsoft.com/office/drawing/2015/9/8/chartex" xmlns:cx2="http://schemas.microsoft.com/office/drawing/2015/10/21/chartex" xmlns:cx3="http://schemas.microsoft.com/office/drawing/2016/5/9/chartex" xmlns:cx4="http://schemas.microsoft.com/office/drawing/2016/5/10/chartex" xmlns:cx5="http://schemas.microsoft.com/office/drawing/2016/5/11/chartex" xmlns:cx6="http://schemas.microsoft.com/office/drawing/2016/5/12/chartex" xmlns:cx7="http://schemas.microsoft.com/office/drawing/2016/5/13/chartex" xmlns:cx8="http://schemas.microsoft.com/office/drawing/2016/5/14/chartex" xmlns:mc="http://schemas.openxmlformats.org/markup-compatibility/2006" xmlns:aink="http://schemas.microsoft.com/office/drawing/2016/ink" xmlns:am3d="http://schemas.microsoft.com/office/drawing/2017/model3d" xmlns:o="urn:schemas-microsoft-com:office:office" xmlns:oel="http://schemas.microsoft.com/office/2019/extlst" xmlns:r="http://schemas.openxmlformats.org/officeDocument/2006/relationships" xmlns:m="http://schemas.openxmlformats.org/officeDocument/2006/math" xmlns:v="urn:schemas-microsoft-com:vml" xmlns:wp14="http://schemas.microsoft.com/office/word/2010/wordprocessingDrawing" xmlns:wp="http://schemas.openxmlformats.org/drawingml/2006/wordprocessingDrawing" xmlns:w10="urn:schemas-microsoft-com:office:word" xmlns:w="http://schemas.openxmlformats.org/wordprocessingml/2006/main" xmlns:w14="http://schemas.microsoft.com/office/word/2010/wordml" xmlns:w15="http://schemas.microsoft.com/office/word/2012/wordml" xmlns:w16cex="http://schemas.microsoft.com/office/word/2018/wordml/cex" xmlns:w16cid="http://schemas.microsoft.com/office/word/2016/wordml/cid" xmlns:w16="http://schemas.microsoft.com/office/word/2018/wordml" xmlns:w16du="http://schemas.microsoft.com/office/word/2023/wordml/word16du" xmlns:w16sdtdh="http://schemas.microsoft.com/office/word/2020/wordml/sdtdatahash" xmlns:w16sdtfl="http://schemas.microsoft.com/office/word/2024/wordml/sdtformatlock" xmlns:w16se="http://schemas.microsoft.com/office/word/2015/wordml/symex" xmlns:wpg="http://schemas.microsoft.com/office/word/2010/wordprocessingGroup" xmlns:wpi="http://schemas.microsoft.com/office/word/2010/wordprocessingInk" xmlns:wne="http://schemas.microsoft.com/office/word/2006/wordml" xmlns:wps="http://schemas.microsoft.com/office/word/2010/wordprocessingShape" mc:Ignorable="w14 w15 w16se w16cid w16 w16cex w16sdtdh w16sdtfl w16du wp14">
+  <w:comment w:id="0" w:author="Renato Astargo" w:date="2026-10-16T17:22:00Z" w:initials="RA">
+    <w:p>
+      <w:pPr>
+        <w:pStyle w:val="Textocomentario"/>
+      </w:pPr>
+      <w:r>
+        <w:rPr>
+          <w:rStyle w:val="Refdecomentario"/>
+        </w:rPr>
+        <w:annotationRef/>
+      </w:r>
+      <w:r>
+        <w:t>Pendiente</w:t>
+      </w:r>
+    </w:p>
+  </w:comment>
+  <w:comment w:id="1" w:author="Renato Astargo" w:date="2026-10-16T17:30:00Z" w:initials="RA">
+    <w:p>
+      <w:pPr>
+        <w:pStyle w:val="Textocomentario"/>
+      </w:pPr>
+      <w:r>
+        <w:rPr>
+          <w:rStyle w:val="Refdecomentario"/>
+        </w:rPr>
+        <w:annotationRef/>
+      </w:r>
+      <w:r>
+        <w:t>Pendiente</w:t>
+      </w:r>
+    </w:p>
+  </w:comment>
+</w:comments>
+</file>
+
+<file path=word/commentsExtended.xml><?xml version="1.0" encoding="utf-8"?>
+<w15:commentsEx xmlns:wpc="http://schemas.microsoft.com/office/word/2010/wordprocessingCanvas" xmlns:cx="http://schemas.microsoft.com/office/drawing/2014/chartex" xmlns:cx1="http://schemas.microsoft.com/office/drawing/2015/9/8/chartex" xmlns:cx2="http://schemas.microsoft.com/office/drawing/2015/10/21/chartex" xmlns:cx3="http://schemas.microsoft.com/office/drawing/2016/5/9/chartex" xmlns:cx4="http://schemas.microsoft.com/office/drawing/2016/5/10/chartex" xmlns:cx5="http://schemas.microsoft.com/office/drawing/2016/5/11/chartex" xmlns:cx6="http://schemas.microsoft.com/office/drawing/2016/5/12/chartex" xmlns:cx7="http://schemas.microsoft.com/office/drawing/2016/5/13/chartex" xmlns:cx8="http://schemas.microsoft.com/office/drawing/2016/5/14/chartex" xmlns:mc="http://schemas.openxmlformats.org/markup-compatibility/2006" xmlns:aink="http://schemas.microsoft.com/office/drawing/2016/ink" xmlns:am3d="http://schemas.microsoft.com/office/drawing/2017/model3d" xmlns:o="urn:schemas-microsoft-com:office:office" xmlns:oel="http://schemas.microsoft.com/office/2019/extlst" xmlns:r="http://schemas.openxmlformats.org/officeDocument/2006/relationships" xmlns:m="http://schemas.openxmlformats.org/officeDocument/2006/math" xmlns:v="urn:schemas-microsoft-com:vml" xmlns:wp14="http://schemas.microsoft.com/office/word/2010/wordprocessingDrawing" xmlns:wp="http://schemas.openxmlformats.org/drawingml/2006/wordprocessingDrawing" xmlns:w10="urn:schemas-microsoft-com:office:word" xmlns:w="http://schemas.openxmlformats.org/wordprocessingml/2006/main" xmlns:w14="http://schemas.microsoft.com/office/word/2010/wordml" xmlns:w15="http://schemas.microsoft.com/office/word/2012/wordml" xmlns:w16cex="http://schemas.microsoft.com/office/word/2018/wordml/cex" xmlns:w16cid="http://schemas.microsoft.com/office/word/2016/wordml/cid" xmlns:w16="http://schemas.microsoft.com/office/word/2018/wordml" xmlns:w16du="http://schemas.microsoft.com/office/word/2023/wordml/word16du" xmlns:w16sdtdh="http://schemas.microsoft.com/office/word/2020/wordml/sdtdatahash" xmlns:w16sdtfl="http://schemas.microsoft.com/office/word/2024/wordml/sdtformatlock" xmlns:w16se="http://schemas.microsoft.com/office/word/2015/wordml/symex" xmlns:wpg="http://schemas.microsoft.com/office/word/2010/wordprocessingGroup" xmlns:wpi="http://schemas.microsoft.com/office/word/2010/wordprocessingInk" xmlns:wne="http://schemas.microsoft.com/office/word/2006/wordml" xmlns:wps="http://schemas.microsoft.com/office/word/2010/wordprocessingShape" mc:Ignorable="w14 w15 w16se w16cid w16 w16cex w16sdtdh w16sdtfl w16du wp14">
+  <w15:commentEx w15:paraId="53AD942C" w15:done="0"/>
+  <w15:commentEx w15:paraId="4B91512F" w15:done="0"/>
+</w15:commentsEx>
+</file>
+
+<file path=word/commentsExtensible.xml><?xml version="1.0" encoding="utf-8"?>
+<w16cex:commentsExtensible xmlns:wpc="http://schemas.microsoft.com/office/word/2010/wordprocessingCanvas" xmlns:cx="http://schemas.microsoft.com/office/drawing/2014/chartex" xmlns:cx1="http://schemas.microsoft.com/office/drawing/2015/9/8/chartex" xmlns:cx2="http://schemas.microsoft.com/office/drawing/2015/10/21/chartex" xmlns:cx3="http://schemas.microsoft.com/office/drawing/2016/5/9/chartex" xmlns:cx4="http://schemas.microsoft.com/office/drawing/2016/5/10/chartex" xmlns:cx5="http://schemas.microsoft.com/office/drawing/2016/5/11/chartex" xmlns:cx6="http://schemas.microsoft.com/office/drawing/2016/5/12/chartex" xmlns:cx7="http://schemas.microsoft.com/office/drawing/2016/5/13/chartex" xmlns:cx8="http://schemas.microsoft.com/office/drawing/2016/5/14/chartex" xmlns:cr="http://schemas.microsoft.com/office/comments/2020/reactions" xmlns:mc="http://schemas.openxmlformats.org/markup-compatibility/2006" xmlns:aink="http://schemas.microsoft.com/office/drawing/2016/ink" xmlns:am3d="http://schemas.microsoft.com/office/drawing/2017/model3d" xmlns:o="urn:schemas-microsoft-com:office:office" xmlns:oel="http://schemas.microsoft.com/office/2019/extlst" xmlns:r="http://schemas.openxmlformats.org/officeDocument/2006/relationships" xmlns:m="http://schemas.openxmlformats.org/officeDocument/2006/math" xmlns:v="urn:schemas-microsoft-com:vml" xmlns:wp14="http://schemas.microsoft.com/office/word/2010/wordprocessingDrawing" xmlns:wp="http://schemas.openxmlformats.org/drawingml/2006/wordprocessingDrawing" xmlns:w10="urn:schemas-microsoft-com:office:word" xmlns:w="http://schemas.openxmlformats.org/wordprocessingml/2006/main" xmlns:w14="http://schemas.microsoft.com/office/word/2010/wordml" xmlns:w15="http://schemas.microsoft.com/office/word/2012/wordml" xmlns:w16cex="http://schemas.microsoft.com/office/word/2018/wordml/cex" xmlns:w16cid="http://schemas.microsoft.com/office/word/2016/wordml/cid" xmlns:w16="http://schemas.microsoft.com/office/word/2018/wordml" xmlns:w16du="http://schemas.microsoft.com/office/word/2023/wordml/word16du" xmlns:w16sdtdh="http://schemas.microsoft.com/office/word/2020/wordml/sdtdatahash" xmlns:w16sdtfl="http://schemas.microsoft.com/office/word/2024/wordml/sdtformatlock" xmlns:w16se="http://schemas.microsoft.com/office/word/2015/wordml/symex" xmlns:wpg="http://schemas.microsoft.com/office/word/2010/wordprocessingGroup" xmlns:wpi="http://schemas.microsoft.com/office/word/2010/wordprocessingInk" xmlns:wne="http://schemas.microsoft.com/office/word/2006/wordml" xmlns:wps="http://schemas.microsoft.com/office/word/2010/wordprocessingShape" mc:Ignorable="w14 w15 w16se w16cid w16 w16cex w16sdtdh w16sdtfl cr w16du wp14">
+  <w16cex:commentExtensible w16cex:durableId="54869CB3" w16cex:dateUtc="2026-10-16T20:22:00Z"/>
+  <w16cex:commentExtensible w16cex:durableId="06E96340" w16cex:dateUtc="2026-10-16T20:30:00Z"/>
+</w16cex:commentsExtensible>
+</file>
+
+<file path=word/commentsIds.xml><?xml version="1.0" encoding="utf-8"?>
+<w16cid:commentsIds xmlns:wpc="http://schemas.microsoft.com/office/word/2010/wordprocessingCanvas" xmlns:cx="http://schemas.microsoft.com/office/drawing/2014/chartex" xmlns:cx1="http://schemas.microsoft.com/office/drawing/2015/9/8/chartex" xmlns:cx2="http://schemas.microsoft.com/office/drawing/2015/10/21/chartex" xmlns:cx3="http://schemas.microsoft.com/office/drawing/2016/5/9/chartex" xmlns:cx4="http://schemas.microsoft.com/office/drawing/2016/5/10/chartex" xmlns:cx5="http://schemas.microsoft.com/office/drawing/2016/5/11/chartex" xmlns:cx6="http://schemas.microsoft.com/office/drawing/2016/5/12/chartex" xmlns:cx7="http://schemas.microsoft.com/office/drawing/2016/5/13/chartex" xmlns:cx8="http://schemas.microsoft.com/office/drawing/2016/5/14/chartex" xmlns:mc="http://schemas.openxmlformats.org/markup-compatibility/2006" xmlns:aink="http://schemas.microsoft.com/office/drawing/2016/ink" xmlns:am3d="http://schemas.microsoft.com/office/drawing/2017/model3d" xmlns:o="urn:schemas-microsoft-com:office:office" xmlns:oel="http://schemas.microsoft.com/office/2019/extlst" xmlns:r="http://schemas.openxmlformats.org/officeDocument/2006/relationships" xmlns:m="http://schemas.openxmlformats.org/officeDocument/2006/math" xmlns:v="urn:schemas-microsoft-com:vml" xmlns:wp14="http://schemas.microsoft.com/office/word/2010/wordprocessingDrawing" xmlns:wp="http://schemas.openxmlformats.org/drawingml/2006/wordprocessingDrawing" xmlns:w10="urn:schemas-microsoft-com:office:word" xmlns:w="http://schemas.openxmlformats.org/wordprocessingml/2006/main" xmlns:w14="http://schemas.microsoft.com/office/word/2010/wordml" xmlns:w15="http://schemas.microsoft.com/office/word/2012/wordml" xmlns:w16cex="http://schemas.microsoft.com/office/word/2018/wordml/cex" xmlns:w16cid="http://schemas.microsoft.com/office/word/2016/wordml/cid" xmlns:w16="http://schemas.microsoft.com/office/word/2018/wordml" xmlns:w16du="http://schemas.microsoft.com/office/word/2023/wordml/word16du" xmlns:w16sdtdh="http://schemas.microsoft.com/office/word/2020/wordml/sdtdatahash" xmlns:w16sdtfl="http://schemas.microsoft.com/office/word/2024/wordml/sdtformatlock" xmlns:w16se="http://schemas.microsoft.com/office/word/2015/wordml/symex" xmlns:wpg="http://schemas.microsoft.com/office/word/2010/wordprocessingGroup" xmlns:wpi="http://schemas.microsoft.com/office/word/2010/wordprocessingInk" xmlns:wne="http://schemas.microsoft.com/office/word/2006/wordml" xmlns:wps="http://schemas.microsoft.com/office/word/2010/wordprocessingShape" mc:Ignorable="w14 w15 w16se w16cid w16 w16cex w16sdtdh w16sdtfl w16du wp14">
+  <w16cid:commentId w16cid:paraId="53AD942C" w16cid:durableId="54869CB3"/>
+  <w16cid:commentId w16cid:paraId="4B91512F" w16cid:durableId="06E96340"/>
+</w16cid:commentsIds>
 </file>
 
 <file path=word/endnotes.xml><?xml version="1.0" encoding="utf-8"?>
@@ -3300,6 +3718,155 @@
     </w:lvl>
   </w:abstractNum>
   <w:abstractNum w:abstractNumId="2" w15:restartNumberingAfterBreak="0">
+    <w:nsid w:val="07CD67D8"/>
+    <w:multiLevelType w:val="multilevel"/>
+    <w:tmpl w:val="267CB8AA"/>
+    <w:lvl w:ilvl="0">
+      <w:start w:val="1"/>
+      <w:numFmt w:val="bullet"/>
+      <w:lvlText w:val=""/>
+      <w:lvlJc w:val="left"/>
+      <w:pPr>
+        <w:tabs>
+          <w:tab w:val="num" w:pos="720"/>
+        </w:tabs>
+        <w:ind w:left="720" w:hanging="360"/>
+      </w:pPr>
+      <w:rPr>
+        <w:rFonts w:ascii="Symbol" w:hAnsi="Symbol" w:hint="default"/>
+        <w:sz w:val="20"/>
+      </w:rPr>
+    </w:lvl>
+    <w:lvl w:ilvl="1" w:tentative="1">
+      <w:start w:val="1"/>
+      <w:numFmt w:val="bullet"/>
+      <w:lvlText w:val="o"/>
+      <w:lvlJc w:val="left"/>
+      <w:pPr>
+        <w:tabs>
+          <w:tab w:val="num" w:pos="1440"/>
+        </w:tabs>
+        <w:ind w:left="1440" w:hanging="360"/>
+      </w:pPr>
+      <w:rPr>
+        <w:rFonts w:ascii="Courier New" w:hAnsi="Courier New" w:hint="default"/>
+        <w:sz w:val="20"/>
+      </w:rPr>
+    </w:lvl>
+    <w:lvl w:ilvl="2" w:tentative="1">
+      <w:start w:val="1"/>
+      <w:numFmt w:val="bullet"/>
+      <w:lvlText w:val=""/>
+      <w:lvlJc w:val="left"/>
+      <w:pPr>
+        <w:tabs>
+          <w:tab w:val="num" w:pos="2160"/>
+        </w:tabs>
+        <w:ind w:left="2160" w:hanging="360"/>
+      </w:pPr>
+      <w:rPr>
+        <w:rFonts w:ascii="Wingdings" w:hAnsi="Wingdings" w:hint="default"/>
+        <w:sz w:val="20"/>
+      </w:rPr>
+    </w:lvl>
+    <w:lvl w:ilvl="3" w:tentative="1">
+      <w:start w:val="1"/>
+      <w:numFmt w:val="bullet"/>
+      <w:lvlText w:val=""/>
+      <w:lvlJc w:val="left"/>
+      <w:pPr>
+        <w:tabs>
+          <w:tab w:val="num" w:pos="2880"/>
+        </w:tabs>
+        <w:ind w:left="2880" w:hanging="360"/>
+      </w:pPr>
+      <w:rPr>
+        <w:rFonts w:ascii="Wingdings" w:hAnsi="Wingdings" w:hint="default"/>
+        <w:sz w:val="20"/>
+      </w:rPr>
+    </w:lvl>
+    <w:lvl w:ilvl="4" w:tentative="1">
+      <w:start w:val="1"/>
+      <w:numFmt w:val="bullet"/>
+      <w:lvlText w:val=""/>
+      <w:lvlJc w:val="left"/>
+      <w:pPr>
+        <w:tabs>
+          <w:tab w:val="num" w:pos="3600"/>
+        </w:tabs>
+        <w:ind w:left="3600" w:hanging="360"/>
+      </w:pPr>
+      <w:rPr>
+        <w:rFonts w:ascii="Wingdings" w:hAnsi="Wingdings" w:hint="default"/>
+        <w:sz w:val="20"/>
+      </w:rPr>
+    </w:lvl>
+    <w:lvl w:ilvl="5" w:tentative="1">
+      <w:start w:val="1"/>
+      <w:numFmt w:val="bullet"/>
+      <w:lvlText w:val=""/>
+      <w:lvlJc w:val="left"/>
+      <w:pPr>
+        <w:tabs>
+          <w:tab w:val="num" w:pos="4320"/>
+        </w:tabs>
+        <w:ind w:left="4320" w:hanging="360"/>
+      </w:pPr>
+      <w:rPr>
+        <w:rFonts w:ascii="Wingdings" w:hAnsi="Wingdings" w:hint="default"/>
+        <w:sz w:val="20"/>
+      </w:rPr>
+    </w:lvl>
+    <w:lvl w:ilvl="6" w:tentative="1">
+      <w:start w:val="1"/>
+      <w:numFmt w:val="bullet"/>
+      <w:lvlText w:val=""/>
+      <w:lvlJc w:val="left"/>
+      <w:pPr>
+        <w:tabs>
+          <w:tab w:val="num" w:pos="5040"/>
+        </w:tabs>
+        <w:ind w:left="5040" w:hanging="360"/>
+      </w:pPr>
+      <w:rPr>
+        <w:rFonts w:ascii="Wingdings" w:hAnsi="Wingdings" w:hint="default"/>
+        <w:sz w:val="20"/>
+      </w:rPr>
+    </w:lvl>
+    <w:lvl w:ilvl="7" w:tentative="1">
+      <w:start w:val="1"/>
+      <w:numFmt w:val="bullet"/>
+      <w:lvlText w:val=""/>
+      <w:lvlJc w:val="left"/>
+      <w:pPr>
+        <w:tabs>
+          <w:tab w:val="num" w:pos="5760"/>
+        </w:tabs>
+        <w:ind w:left="5760" w:hanging="360"/>
+      </w:pPr>
+      <w:rPr>
+        <w:rFonts w:ascii="Wingdings" w:hAnsi="Wingdings" w:hint="default"/>
+        <w:sz w:val="20"/>
+      </w:rPr>
+    </w:lvl>
+    <w:lvl w:ilvl="8" w:tentative="1">
+      <w:start w:val="1"/>
+      <w:numFmt w:val="bullet"/>
+      <w:lvlText w:val=""/>
+      <w:lvlJc w:val="left"/>
+      <w:pPr>
+        <w:tabs>
+          <w:tab w:val="num" w:pos="6480"/>
+        </w:tabs>
+        <w:ind w:left="6480" w:hanging="360"/>
+      </w:pPr>
+      <w:rPr>
+        <w:rFonts w:ascii="Wingdings" w:hAnsi="Wingdings" w:hint="default"/>
+        <w:sz w:val="20"/>
+      </w:rPr>
+    </w:lvl>
+  </w:abstractNum>
+  <w:abstractNum w:abstractNumId="3" w15:restartNumberingAfterBreak="0">
     <w:nsid w:val="0B044D22"/>
     <w:multiLevelType w:val="multilevel"/>
     <w:tmpl w:val="B636CF8A"/>
@@ -3448,7 +4015,7 @@
       </w:rPr>
     </w:lvl>
   </w:abstractNum>
-  <w:abstractNum w:abstractNumId="3" w15:restartNumberingAfterBreak="0">
+  <w:abstractNum w:abstractNumId="4" w15:restartNumberingAfterBreak="0">
     <w:nsid w:val="17391B83"/>
     <w:multiLevelType w:val="multilevel"/>
     <w:tmpl w:val="5DD04BFA"/>
@@ -3597,7 +4164,183 @@
       </w:rPr>
     </w:lvl>
   </w:abstractNum>
-  <w:abstractNum w:abstractNumId="4" w15:restartNumberingAfterBreak="0">
+  <w:abstractNum w:abstractNumId="5" w15:restartNumberingAfterBreak="0">
+    <w:nsid w:val="18AD5573"/>
+    <w:multiLevelType w:val="hybridMultilevel"/>
+    <w:tmpl w:val="4A32EC42"/>
+    <w:lvl w:ilvl="0" w:tplc="85A0BA66">
+      <w:start w:val="1"/>
+      <w:numFmt w:val="decimal"/>
+      <w:lvlText w:val="%1."/>
+      <w:lvlJc w:val="left"/>
+      <w:pPr>
+        <w:ind w:left="1068" w:hanging="708"/>
+      </w:pPr>
+      <w:rPr>
+        <w:rFonts w:hint="default"/>
+        <w:b w:val="0"/>
+      </w:rPr>
+    </w:lvl>
+    <w:lvl w:ilvl="1" w:tplc="340A0019" w:tentative="1">
+      <w:start w:val="1"/>
+      <w:numFmt w:val="lowerLetter"/>
+      <w:lvlText w:val="%2."/>
+      <w:lvlJc w:val="left"/>
+      <w:pPr>
+        <w:ind w:left="1440" w:hanging="360"/>
+      </w:pPr>
+    </w:lvl>
+    <w:lvl w:ilvl="2" w:tplc="340A001B" w:tentative="1">
+      <w:start w:val="1"/>
+      <w:numFmt w:val="lowerRoman"/>
+      <w:lvlText w:val="%3."/>
+      <w:lvlJc w:val="right"/>
+      <w:pPr>
+        <w:ind w:left="2160" w:hanging="180"/>
+      </w:pPr>
+    </w:lvl>
+    <w:lvl w:ilvl="3" w:tplc="340A000F" w:tentative="1">
+      <w:start w:val="1"/>
+      <w:numFmt w:val="decimal"/>
+      <w:lvlText w:val="%4."/>
+      <w:lvlJc w:val="left"/>
+      <w:pPr>
+        <w:ind w:left="2880" w:hanging="360"/>
+      </w:pPr>
+    </w:lvl>
+    <w:lvl w:ilvl="4" w:tplc="340A0019" w:tentative="1">
+      <w:start w:val="1"/>
+      <w:numFmt w:val="lowerLetter"/>
+      <w:lvlText w:val="%5."/>
+      <w:lvlJc w:val="left"/>
+      <w:pPr>
+        <w:ind w:left="3600" w:hanging="360"/>
+      </w:pPr>
+    </w:lvl>
+    <w:lvl w:ilvl="5" w:tplc="340A001B" w:tentative="1">
+      <w:start w:val="1"/>
+      <w:numFmt w:val="lowerRoman"/>
+      <w:lvlText w:val="%6."/>
+      <w:lvlJc w:val="right"/>
+      <w:pPr>
+        <w:ind w:left="4320" w:hanging="180"/>
+      </w:pPr>
+    </w:lvl>
+    <w:lvl w:ilvl="6" w:tplc="340A000F" w:tentative="1">
+      <w:start w:val="1"/>
+      <w:numFmt w:val="decimal"/>
+      <w:lvlText w:val="%7."/>
+      <w:lvlJc w:val="left"/>
+      <w:pPr>
+        <w:ind w:left="5040" w:hanging="360"/>
+      </w:pPr>
+    </w:lvl>
+    <w:lvl w:ilvl="7" w:tplc="340A0019" w:tentative="1">
+      <w:start w:val="1"/>
+      <w:numFmt w:val="lowerLetter"/>
+      <w:lvlText w:val="%8."/>
+      <w:lvlJc w:val="left"/>
+      <w:pPr>
+        <w:ind w:left="5760" w:hanging="360"/>
+      </w:pPr>
+    </w:lvl>
+    <w:lvl w:ilvl="8" w:tplc="340A001B" w:tentative="1">
+      <w:start w:val="1"/>
+      <w:numFmt w:val="lowerRoman"/>
+      <w:lvlText w:val="%9."/>
+      <w:lvlJc w:val="right"/>
+      <w:pPr>
+        <w:ind w:left="6480" w:hanging="180"/>
+      </w:pPr>
+    </w:lvl>
+  </w:abstractNum>
+  <w:abstractNum w:abstractNumId="6" w15:restartNumberingAfterBreak="0">
+    <w:nsid w:val="19436750"/>
+    <w:multiLevelType w:val="multilevel"/>
+    <w:tmpl w:val="340A001F"/>
+    <w:lvl w:ilvl="0">
+      <w:start w:val="1"/>
+      <w:numFmt w:val="decimal"/>
+      <w:lvlText w:val="%1."/>
+      <w:lvlJc w:val="left"/>
+      <w:pPr>
+        <w:ind w:left="360" w:hanging="360"/>
+      </w:pPr>
+    </w:lvl>
+    <w:lvl w:ilvl="1">
+      <w:start w:val="1"/>
+      <w:numFmt w:val="decimal"/>
+      <w:lvlText w:val="%1.%2."/>
+      <w:lvlJc w:val="left"/>
+      <w:pPr>
+        <w:ind w:left="792" w:hanging="432"/>
+      </w:pPr>
+    </w:lvl>
+    <w:lvl w:ilvl="2">
+      <w:start w:val="1"/>
+      <w:numFmt w:val="decimal"/>
+      <w:lvlText w:val="%1.%2.%3."/>
+      <w:lvlJc w:val="left"/>
+      <w:pPr>
+        <w:ind w:left="1224" w:hanging="504"/>
+      </w:pPr>
+    </w:lvl>
+    <w:lvl w:ilvl="3">
+      <w:start w:val="1"/>
+      <w:numFmt w:val="decimal"/>
+      <w:lvlText w:val="%1.%2.%3.%4."/>
+      <w:lvlJc w:val="left"/>
+      <w:pPr>
+        <w:ind w:left="1728" w:hanging="648"/>
+      </w:pPr>
+    </w:lvl>
+    <w:lvl w:ilvl="4">
+      <w:start w:val="1"/>
+      <w:numFmt w:val="decimal"/>
+      <w:lvlText w:val="%1.%2.%3.%4.%5."/>
+      <w:lvlJc w:val="left"/>
+      <w:pPr>
+        <w:ind w:left="2232" w:hanging="792"/>
+      </w:pPr>
+    </w:lvl>
+    <w:lvl w:ilvl="5">
+      <w:start w:val="1"/>
+      <w:numFmt w:val="decimal"/>
+      <w:lvlText w:val="%1.%2.%3.%4.%5.%6."/>
+      <w:lvlJc w:val="left"/>
+      <w:pPr>
+        <w:ind w:left="2736" w:hanging="936"/>
+      </w:pPr>
+    </w:lvl>
+    <w:lvl w:ilvl="6">
+      <w:start w:val="1"/>
+      <w:numFmt w:val="decimal"/>
+      <w:lvlText w:val="%1.%2.%3.%4.%5.%6.%7."/>
+      <w:lvlJc w:val="left"/>
+      <w:pPr>
+        <w:ind w:left="3240" w:hanging="1080"/>
+      </w:pPr>
+    </w:lvl>
+    <w:lvl w:ilvl="7">
+      <w:start w:val="1"/>
+      <w:numFmt w:val="decimal"/>
+      <w:lvlText w:val="%1.%2.%3.%4.%5.%6.%7.%8."/>
+      <w:lvlJc w:val="left"/>
+      <w:pPr>
+        <w:ind w:left="3744" w:hanging="1224"/>
+      </w:pPr>
+    </w:lvl>
+    <w:lvl w:ilvl="8">
+      <w:start w:val="1"/>
+      <w:numFmt w:val="decimal"/>
+      <w:lvlText w:val="%1.%2.%3.%4.%5.%6.%7.%8.%9."/>
+      <w:lvlJc w:val="left"/>
+      <w:pPr>
+        <w:ind w:left="4320" w:hanging="1440"/>
+      </w:pPr>
+    </w:lvl>
+  </w:abstractNum>
+  <w:abstractNum w:abstractNumId="7" w15:restartNumberingAfterBreak="0">
     <w:nsid w:val="19FC06D1"/>
     <w:multiLevelType w:val="multilevel"/>
     <w:tmpl w:val="8280EAD8"/>
@@ -3746,7 +4489,7 @@
       </w:rPr>
     </w:lvl>
   </w:abstractNum>
-  <w:abstractNum w:abstractNumId="5" w15:restartNumberingAfterBreak="0">
+  <w:abstractNum w:abstractNumId="8" w15:restartNumberingAfterBreak="0">
     <w:nsid w:val="1B02535C"/>
     <w:multiLevelType w:val="multilevel"/>
     <w:tmpl w:val="5B3A4A1A"/>
@@ -3895,7 +4638,7 @@
       </w:rPr>
     </w:lvl>
   </w:abstractNum>
-  <w:abstractNum w:abstractNumId="6" w15:restartNumberingAfterBreak="0">
+  <w:abstractNum w:abstractNumId="9" w15:restartNumberingAfterBreak="0">
     <w:nsid w:val="1CCA28C0"/>
     <w:multiLevelType w:val="multilevel"/>
     <w:tmpl w:val="08A295A6"/>
@@ -4044,7 +4787,7 @@
       </w:rPr>
     </w:lvl>
   </w:abstractNum>
-  <w:abstractNum w:abstractNumId="7" w15:restartNumberingAfterBreak="0">
+  <w:abstractNum w:abstractNumId="10" w15:restartNumberingAfterBreak="0">
     <w:nsid w:val="253215CC"/>
     <w:multiLevelType w:val="multilevel"/>
     <w:tmpl w:val="B6E4E3BA"/>
@@ -4193,7 +4936,7 @@
       </w:rPr>
     </w:lvl>
   </w:abstractNum>
-  <w:abstractNum w:abstractNumId="8" w15:restartNumberingAfterBreak="0">
+  <w:abstractNum w:abstractNumId="11" w15:restartNumberingAfterBreak="0">
     <w:nsid w:val="255A30F3"/>
     <w:multiLevelType w:val="multilevel"/>
     <w:tmpl w:val="50F66606"/>
@@ -4342,7 +5085,7 @@
       </w:rPr>
     </w:lvl>
   </w:abstractNum>
-  <w:abstractNum w:abstractNumId="9" w15:restartNumberingAfterBreak="0">
+  <w:abstractNum w:abstractNumId="12" w15:restartNumberingAfterBreak="0">
     <w:nsid w:val="26B7742B"/>
     <w:multiLevelType w:val="multilevel"/>
     <w:tmpl w:val="B5EE1C98"/>
@@ -4491,7 +5234,120 @@
       </w:rPr>
     </w:lvl>
   </w:abstractNum>
-  <w:abstractNum w:abstractNumId="10" w15:restartNumberingAfterBreak="0">
+  <w:abstractNum w:abstractNumId="13" w15:restartNumberingAfterBreak="0">
+    <w:nsid w:val="329659FF"/>
+    <w:multiLevelType w:val="multilevel"/>
+    <w:tmpl w:val="A4F49A36"/>
+    <w:lvl w:ilvl="0">
+      <w:start w:val="2"/>
+      <w:numFmt w:val="decimal"/>
+      <w:lvlText w:val="%1"/>
+      <w:lvlJc w:val="left"/>
+      <w:pPr>
+        <w:ind w:left="504" w:hanging="504"/>
+      </w:pPr>
+      <w:rPr>
+        <w:rFonts w:hint="default"/>
+      </w:rPr>
+    </w:lvl>
+    <w:lvl w:ilvl="1">
+      <w:start w:val="4"/>
+      <w:numFmt w:val="decimal"/>
+      <w:lvlText w:val="%1.%2"/>
+      <w:lvlJc w:val="left"/>
+      <w:pPr>
+        <w:ind w:left="504" w:hanging="504"/>
+      </w:pPr>
+      <w:rPr>
+        <w:rFonts w:hint="default"/>
+      </w:rPr>
+    </w:lvl>
+    <w:lvl w:ilvl="2">
+      <w:start w:val="1"/>
+      <w:numFmt w:val="decimal"/>
+      <w:lvlText w:val="%1.%2.%3"/>
+      <w:lvlJc w:val="left"/>
+      <w:pPr>
+        <w:ind w:left="720" w:hanging="720"/>
+      </w:pPr>
+      <w:rPr>
+        <w:rFonts w:hint="default"/>
+      </w:rPr>
+    </w:lvl>
+    <w:lvl w:ilvl="3">
+      <w:start w:val="1"/>
+      <w:numFmt w:val="decimal"/>
+      <w:lvlText w:val="%1.%2.%3.%4"/>
+      <w:lvlJc w:val="left"/>
+      <w:pPr>
+        <w:ind w:left="1080" w:hanging="1080"/>
+      </w:pPr>
+      <w:rPr>
+        <w:rFonts w:hint="default"/>
+      </w:rPr>
+    </w:lvl>
+    <w:lvl w:ilvl="4">
+      <w:start w:val="1"/>
+      <w:numFmt w:val="decimal"/>
+      <w:lvlText w:val="%1.%2.%3.%4.%5"/>
+      <w:lvlJc w:val="left"/>
+      <w:pPr>
+        <w:ind w:left="1080" w:hanging="1080"/>
+      </w:pPr>
+      <w:rPr>
+        <w:rFonts w:hint="default"/>
+      </w:rPr>
+    </w:lvl>
+    <w:lvl w:ilvl="5">
+      <w:start w:val="1"/>
+      <w:numFmt w:val="decimal"/>
+      <w:lvlText w:val="%1.%2.%3.%4.%5.%6"/>
+      <w:lvlJc w:val="left"/>
+      <w:pPr>
+        <w:ind w:left="1440" w:hanging="1440"/>
+      </w:pPr>
+      <w:rPr>
+        <w:rFonts w:hint="default"/>
+      </w:rPr>
+    </w:lvl>
+    <w:lvl w:ilvl="6">
+      <w:start w:val="1"/>
+      <w:numFmt w:val="decimal"/>
+      <w:lvlText w:val="%1.%2.%3.%4.%5.%6.%7"/>
+      <w:lvlJc w:val="left"/>
+      <w:pPr>
+        <w:ind w:left="1440" w:hanging="1440"/>
+      </w:pPr>
+      <w:rPr>
+        <w:rFonts w:hint="default"/>
+      </w:rPr>
+    </w:lvl>
+    <w:lvl w:ilvl="7">
+      <w:start w:val="1"/>
+      <w:numFmt w:val="decimal"/>
+      <w:lvlText w:val="%1.%2.%3.%4.%5.%6.%7.%8"/>
+      <w:lvlJc w:val="left"/>
+      <w:pPr>
+        <w:ind w:left="1800" w:hanging="1800"/>
+      </w:pPr>
+      <w:rPr>
+        <w:rFonts w:hint="default"/>
+      </w:rPr>
+    </w:lvl>
+    <w:lvl w:ilvl="8">
+      <w:start w:val="1"/>
+      <w:numFmt w:val="decimal"/>
+      <w:lvlText w:val="%1.%2.%3.%4.%5.%6.%7.%8.%9"/>
+      <w:lvlJc w:val="left"/>
+      <w:pPr>
+        <w:ind w:left="1800" w:hanging="1800"/>
+      </w:pPr>
+      <w:rPr>
+        <w:rFonts w:hint="default"/>
+      </w:rPr>
+    </w:lvl>
+  </w:abstractNum>
+  <w:abstractNum w:abstractNumId="14" w15:restartNumberingAfterBreak="0">
     <w:nsid w:val="33B85B86"/>
     <w:multiLevelType w:val="multilevel"/>
     <w:tmpl w:val="E25801C4"/>
@@ -4640,7 +5496,7 @@
       </w:rPr>
     </w:lvl>
   </w:abstractNum>
-  <w:abstractNum w:abstractNumId="11" w15:restartNumberingAfterBreak="0">
+  <w:abstractNum w:abstractNumId="15" w15:restartNumberingAfterBreak="0">
     <w:nsid w:val="346008F5"/>
     <w:multiLevelType w:val="multilevel"/>
     <w:tmpl w:val="7A1E6D38"/>
@@ -4789,7 +5645,7 @@
       </w:rPr>
     </w:lvl>
   </w:abstractNum>
-  <w:abstractNum w:abstractNumId="12" w15:restartNumberingAfterBreak="0">
+  <w:abstractNum w:abstractNumId="16" w15:restartNumberingAfterBreak="0">
     <w:nsid w:val="3C1D6632"/>
     <w:multiLevelType w:val="multilevel"/>
     <w:tmpl w:val="B4C0D88C"/>
@@ -4938,7 +5794,7 @@
       </w:rPr>
     </w:lvl>
   </w:abstractNum>
-  <w:abstractNum w:abstractNumId="13" w15:restartNumberingAfterBreak="0">
+  <w:abstractNum w:abstractNumId="17" w15:restartNumberingAfterBreak="0">
     <w:nsid w:val="3FFB3113"/>
     <w:multiLevelType w:val="multilevel"/>
     <w:tmpl w:val="B12C7222"/>
@@ -5087,7 +5943,7 @@
       </w:rPr>
     </w:lvl>
   </w:abstractNum>
-  <w:abstractNum w:abstractNumId="14" w15:restartNumberingAfterBreak="0">
+  <w:abstractNum w:abstractNumId="18" w15:restartNumberingAfterBreak="0">
     <w:nsid w:val="40681ECF"/>
     <w:multiLevelType w:val="multilevel"/>
     <w:tmpl w:val="2610A90A"/>
@@ -5236,7 +6092,7 @@
       </w:rPr>
     </w:lvl>
   </w:abstractNum>
-  <w:abstractNum w:abstractNumId="15" w15:restartNumberingAfterBreak="0">
+  <w:abstractNum w:abstractNumId="19" w15:restartNumberingAfterBreak="0">
     <w:nsid w:val="43C63C12"/>
     <w:multiLevelType w:val="multilevel"/>
     <w:tmpl w:val="7D0CC55A"/>
@@ -5385,7 +6241,156 @@
       </w:rPr>
     </w:lvl>
   </w:abstractNum>
-  <w:abstractNum w:abstractNumId="16" w15:restartNumberingAfterBreak="0">
+  <w:abstractNum w:abstractNumId="20" w15:restartNumberingAfterBreak="0">
+    <w:nsid w:val="586A29E6"/>
+    <w:multiLevelType w:val="multilevel"/>
+    <w:tmpl w:val="5394CD82"/>
+    <w:lvl w:ilvl="0">
+      <w:start w:val="1"/>
+      <w:numFmt w:val="bullet"/>
+      <w:lvlText w:val=""/>
+      <w:lvlJc w:val="left"/>
+      <w:pPr>
+        <w:tabs>
+          <w:tab w:val="num" w:pos="720"/>
+        </w:tabs>
+        <w:ind w:left="720" w:hanging="360"/>
+      </w:pPr>
+      <w:rPr>
+        <w:rFonts w:ascii="Symbol" w:hAnsi="Symbol" w:hint="default"/>
+        <w:sz w:val="20"/>
+      </w:rPr>
+    </w:lvl>
+    <w:lvl w:ilvl="1" w:tentative="1">
+      <w:start w:val="1"/>
+      <w:numFmt w:val="bullet"/>
+      <w:lvlText w:val="o"/>
+      <w:lvlJc w:val="left"/>
+      <w:pPr>
+        <w:tabs>
+          <w:tab w:val="num" w:pos="1440"/>
+        </w:tabs>
+        <w:ind w:left="1440" w:hanging="360"/>
+      </w:pPr>
+      <w:rPr>
+        <w:rFonts w:ascii="Courier New" w:hAnsi="Courier New" w:hint="default"/>
+        <w:sz w:val="20"/>
+      </w:rPr>
+    </w:lvl>
+    <w:lvl w:ilvl="2" w:tentative="1">
+      <w:start w:val="1"/>
+      <w:numFmt w:val="bullet"/>
+      <w:lvlText w:val=""/>
+      <w:lvlJc w:val="left"/>
+      <w:pPr>
+        <w:tabs>
+          <w:tab w:val="num" w:pos="2160"/>
+        </w:tabs>
+        <w:ind w:left="2160" w:hanging="360"/>
+      </w:pPr>
+      <w:rPr>
+        <w:rFonts w:ascii="Wingdings" w:hAnsi="Wingdings" w:hint="default"/>
+        <w:sz w:val="20"/>
+      </w:rPr>
+    </w:lvl>
+    <w:lvl w:ilvl="3" w:tentative="1">
+      <w:start w:val="1"/>
+      <w:numFmt w:val="bullet"/>
+      <w:lvlText w:val=""/>
+      <w:lvlJc w:val="left"/>
+      <w:pPr>
+        <w:tabs>
+          <w:tab w:val="num" w:pos="2880"/>
+        </w:tabs>
+        <w:ind w:left="2880" w:hanging="360"/>
+      </w:pPr>
+      <w:rPr>
+        <w:rFonts w:ascii="Wingdings" w:hAnsi="Wingdings" w:hint="default"/>
+        <w:sz w:val="20"/>
+      </w:rPr>
+    </w:lvl>
+    <w:lvl w:ilvl="4" w:tentative="1">
+      <w:start w:val="1"/>
+      <w:numFmt w:val="bullet"/>
+      <w:lvlText w:val=""/>
+      <w:lvlJc w:val="left"/>
+      <w:pPr>
+        <w:tabs>
+          <w:tab w:val="num" w:pos="3600"/>
+        </w:tabs>
+        <w:ind w:left="3600" w:hanging="360"/>
+      </w:pPr>
+      <w:rPr>
+        <w:rFonts w:ascii="Wingdings" w:hAnsi="Wingdings" w:hint="default"/>
+        <w:sz w:val="20"/>
+      </w:rPr>
+    </w:lvl>
+    <w:lvl w:ilvl="5" w:tentative="1">
+      <w:start w:val="1"/>
+      <w:numFmt w:val="bullet"/>
+      <w:lvlText w:val=""/>
+      <w:lvlJc w:val="left"/>
+      <w:pPr>
+        <w:tabs>
+          <w:tab w:val="num" w:pos="4320"/>
+        </w:tabs>
+        <w:ind w:left="4320" w:hanging="360"/>
+      </w:pPr>
+      <w:rPr>
+        <w:rFonts w:ascii="Wingdings" w:hAnsi="Wingdings" w:hint="default"/>
+        <w:sz w:val="20"/>
+      </w:rPr>
+    </w:lvl>
+    <w:lvl w:ilvl="6" w:tentative="1">
+      <w:start w:val="1"/>
+      <w:numFmt w:val="bullet"/>
+      <w:lvlText w:val=""/>
+      <w:lvlJc w:val="left"/>
+      <w:pPr>
+        <w:tabs>
+          <w:tab w:val="num" w:pos="5040"/>
+        </w:tabs>
+        <w:ind w:left="5040" w:hanging="360"/>
+      </w:pPr>
+      <w:rPr>
+        <w:rFonts w:ascii="Wingdings" w:hAnsi="Wingdings" w:hint="default"/>
+        <w:sz w:val="20"/>
+      </w:rPr>
+    </w:lvl>
+    <w:lvl w:ilvl="7" w:tentative="1">
+      <w:start w:val="1"/>
+      <w:numFmt w:val="bullet"/>
+      <w:lvlText w:val=""/>
+      <w:lvlJc w:val="left"/>
+      <w:pPr>
+        <w:tabs>
+          <w:tab w:val="num" w:pos="5760"/>
+        </w:tabs>
+        <w:ind w:left="5760" w:hanging="360"/>
+      </w:pPr>
+      <w:rPr>
+        <w:rFonts w:ascii="Wingdings" w:hAnsi="Wingdings" w:hint="default"/>
+        <w:sz w:val="20"/>
+      </w:rPr>
+    </w:lvl>
+    <w:lvl w:ilvl="8" w:tentative="1">
+      <w:start w:val="1"/>
+      <w:numFmt w:val="bullet"/>
+      <w:lvlText w:val=""/>
+      <w:lvlJc w:val="left"/>
+      <w:pPr>
+        <w:tabs>
+          <w:tab w:val="num" w:pos="6480"/>
+        </w:tabs>
+        <w:ind w:left="6480" w:hanging="360"/>
+      </w:pPr>
+      <w:rPr>
+        <w:rFonts w:ascii="Wingdings" w:hAnsi="Wingdings" w:hint="default"/>
+        <w:sz w:val="20"/>
+      </w:rPr>
+    </w:lvl>
+  </w:abstractNum>
+  <w:abstractNum w:abstractNumId="21" w15:restartNumberingAfterBreak="0">
     <w:nsid w:val="5BD962FA"/>
     <w:multiLevelType w:val="multilevel"/>
     <w:tmpl w:val="9626D5F0"/>
@@ -5534,7 +6539,7 @@
       </w:rPr>
     </w:lvl>
   </w:abstractNum>
-  <w:abstractNum w:abstractNumId="17" w15:restartNumberingAfterBreak="0">
+  <w:abstractNum w:abstractNumId="22" w15:restartNumberingAfterBreak="0">
     <w:nsid w:val="5C920C53"/>
     <w:multiLevelType w:val="multilevel"/>
     <w:tmpl w:val="18B0699A"/>
@@ -5683,7 +6688,7 @@
       </w:rPr>
     </w:lvl>
   </w:abstractNum>
-  <w:abstractNum w:abstractNumId="18" w15:restartNumberingAfterBreak="0">
+  <w:abstractNum w:abstractNumId="23" w15:restartNumberingAfterBreak="0">
     <w:nsid w:val="5DCA5EF2"/>
     <w:multiLevelType w:val="multilevel"/>
     <w:tmpl w:val="68A87D60"/>
@@ -5832,7 +6837,7 @@
       </w:rPr>
     </w:lvl>
   </w:abstractNum>
-  <w:abstractNum w:abstractNumId="19" w15:restartNumberingAfterBreak="0">
+  <w:abstractNum w:abstractNumId="24" w15:restartNumberingAfterBreak="0">
     <w:nsid w:val="67672B21"/>
     <w:multiLevelType w:val="multilevel"/>
     <w:tmpl w:val="A10CDD54"/>
@@ -5981,7 +6986,7 @@
       </w:rPr>
     </w:lvl>
   </w:abstractNum>
-  <w:abstractNum w:abstractNumId="20" w15:restartNumberingAfterBreak="0">
+  <w:abstractNum w:abstractNumId="25" w15:restartNumberingAfterBreak="0">
     <w:nsid w:val="6AC43BBB"/>
     <w:multiLevelType w:val="multilevel"/>
     <w:tmpl w:val="6EC4BE72"/>
@@ -6094,7 +7099,7 @@
       </w:pPr>
     </w:lvl>
   </w:abstractNum>
-  <w:abstractNum w:abstractNumId="21" w15:restartNumberingAfterBreak="0">
+  <w:abstractNum w:abstractNumId="26" w15:restartNumberingAfterBreak="0">
     <w:nsid w:val="7832771E"/>
     <w:multiLevelType w:val="multilevel"/>
     <w:tmpl w:val="212C0426"/>
@@ -6243,7 +7248,7 @@
       </w:rPr>
     </w:lvl>
   </w:abstractNum>
-  <w:abstractNum w:abstractNumId="22" w15:restartNumberingAfterBreak="0">
+  <w:abstractNum w:abstractNumId="27" w15:restartNumberingAfterBreak="0">
     <w:nsid w:val="7B507A37"/>
     <w:multiLevelType w:val="multilevel"/>
     <w:tmpl w:val="D408EE24"/>
@@ -6392,7 +7397,7 @@
       </w:rPr>
     </w:lvl>
   </w:abstractNum>
-  <w:abstractNum w:abstractNumId="23" w15:restartNumberingAfterBreak="0">
+  <w:abstractNum w:abstractNumId="28" w15:restartNumberingAfterBreak="0">
     <w:nsid w:val="7C103461"/>
     <w:multiLevelType w:val="multilevel"/>
     <w:tmpl w:val="50009DCA"/>
@@ -6541,79 +7546,254 @@
       </w:rPr>
     </w:lvl>
   </w:abstractNum>
+  <w:abstractNum w:abstractNumId="29" w15:restartNumberingAfterBreak="0">
+    <w:nsid w:val="7DFE5D6D"/>
+    <w:multiLevelType w:val="multilevel"/>
+    <w:tmpl w:val="D884EDB4"/>
+    <w:lvl w:ilvl="0">
+      <w:start w:val="1"/>
+      <w:numFmt w:val="bullet"/>
+      <w:lvlText w:val=""/>
+      <w:lvlJc w:val="left"/>
+      <w:pPr>
+        <w:tabs>
+          <w:tab w:val="num" w:pos="720"/>
+        </w:tabs>
+        <w:ind w:left="720" w:hanging="360"/>
+      </w:pPr>
+      <w:rPr>
+        <w:rFonts w:ascii="Symbol" w:hAnsi="Symbol" w:hint="default"/>
+        <w:sz w:val="20"/>
+      </w:rPr>
+    </w:lvl>
+    <w:lvl w:ilvl="1" w:tentative="1">
+      <w:start w:val="1"/>
+      <w:numFmt w:val="bullet"/>
+      <w:lvlText w:val="o"/>
+      <w:lvlJc w:val="left"/>
+      <w:pPr>
+        <w:tabs>
+          <w:tab w:val="num" w:pos="1440"/>
+        </w:tabs>
+        <w:ind w:left="1440" w:hanging="360"/>
+      </w:pPr>
+      <w:rPr>
+        <w:rFonts w:ascii="Courier New" w:hAnsi="Courier New" w:hint="default"/>
+        <w:sz w:val="20"/>
+      </w:rPr>
+    </w:lvl>
+    <w:lvl w:ilvl="2" w:tentative="1">
+      <w:start w:val="1"/>
+      <w:numFmt w:val="bullet"/>
+      <w:lvlText w:val=""/>
+      <w:lvlJc w:val="left"/>
+      <w:pPr>
+        <w:tabs>
+          <w:tab w:val="num" w:pos="2160"/>
+        </w:tabs>
+        <w:ind w:left="2160" w:hanging="360"/>
+      </w:pPr>
+      <w:rPr>
+        <w:rFonts w:ascii="Wingdings" w:hAnsi="Wingdings" w:hint="default"/>
+        <w:sz w:val="20"/>
+      </w:rPr>
+    </w:lvl>
+    <w:lvl w:ilvl="3" w:tentative="1">
+      <w:start w:val="1"/>
+      <w:numFmt w:val="bullet"/>
+      <w:lvlText w:val=""/>
+      <w:lvlJc w:val="left"/>
+      <w:pPr>
+        <w:tabs>
+          <w:tab w:val="num" w:pos="2880"/>
+        </w:tabs>
+        <w:ind w:left="2880" w:hanging="360"/>
+      </w:pPr>
+      <w:rPr>
+        <w:rFonts w:ascii="Wingdings" w:hAnsi="Wingdings" w:hint="default"/>
+        <w:sz w:val="20"/>
+      </w:rPr>
+    </w:lvl>
+    <w:lvl w:ilvl="4" w:tentative="1">
+      <w:start w:val="1"/>
+      <w:numFmt w:val="bullet"/>
+      <w:lvlText w:val=""/>
+      <w:lvlJc w:val="left"/>
+      <w:pPr>
+        <w:tabs>
+          <w:tab w:val="num" w:pos="3600"/>
+        </w:tabs>
+        <w:ind w:left="3600" w:hanging="360"/>
+      </w:pPr>
+      <w:rPr>
+        <w:rFonts w:ascii="Wingdings" w:hAnsi="Wingdings" w:hint="default"/>
+        <w:sz w:val="20"/>
+      </w:rPr>
+    </w:lvl>
+    <w:lvl w:ilvl="5" w:tentative="1">
+      <w:start w:val="1"/>
+      <w:numFmt w:val="bullet"/>
+      <w:lvlText w:val=""/>
+      <w:lvlJc w:val="left"/>
+      <w:pPr>
+        <w:tabs>
+          <w:tab w:val="num" w:pos="4320"/>
+        </w:tabs>
+        <w:ind w:left="4320" w:hanging="360"/>
+      </w:pPr>
+      <w:rPr>
+        <w:rFonts w:ascii="Wingdings" w:hAnsi="Wingdings" w:hint="default"/>
+        <w:sz w:val="20"/>
+      </w:rPr>
+    </w:lvl>
+    <w:lvl w:ilvl="6" w:tentative="1">
+      <w:start w:val="1"/>
+      <w:numFmt w:val="bullet"/>
+      <w:lvlText w:val=""/>
+      <w:lvlJc w:val="left"/>
+      <w:pPr>
+        <w:tabs>
+          <w:tab w:val="num" w:pos="5040"/>
+        </w:tabs>
+        <w:ind w:left="5040" w:hanging="360"/>
+      </w:pPr>
+      <w:rPr>
+        <w:rFonts w:ascii="Wingdings" w:hAnsi="Wingdings" w:hint="default"/>
+        <w:sz w:val="20"/>
+      </w:rPr>
+    </w:lvl>
+    <w:lvl w:ilvl="7" w:tentative="1">
+      <w:start w:val="1"/>
+      <w:numFmt w:val="bullet"/>
+      <w:lvlText w:val=""/>
+      <w:lvlJc w:val="left"/>
+      <w:pPr>
+        <w:tabs>
+          <w:tab w:val="num" w:pos="5760"/>
+        </w:tabs>
+        <w:ind w:left="5760" w:hanging="360"/>
+      </w:pPr>
+      <w:rPr>
+        <w:rFonts w:ascii="Wingdings" w:hAnsi="Wingdings" w:hint="default"/>
+        <w:sz w:val="20"/>
+      </w:rPr>
+    </w:lvl>
+    <w:lvl w:ilvl="8" w:tentative="1">
+      <w:start w:val="1"/>
+      <w:numFmt w:val="bullet"/>
+      <w:lvlText w:val=""/>
+      <w:lvlJc w:val="left"/>
+      <w:pPr>
+        <w:tabs>
+          <w:tab w:val="num" w:pos="6480"/>
+        </w:tabs>
+        <w:ind w:left="6480" w:hanging="360"/>
+      </w:pPr>
+      <w:rPr>
+        <w:rFonts w:ascii="Wingdings" w:hAnsi="Wingdings" w:hint="default"/>
+        <w:sz w:val="20"/>
+      </w:rPr>
+    </w:lvl>
+  </w:abstractNum>
   <w:num w:numId="1" w16cid:durableId="463544831">
-    <w:abstractNumId w:val="18"/>
+    <w:abstractNumId w:val="23"/>
   </w:num>
   <w:num w:numId="2" w16cid:durableId="1198082705">
-    <w:abstractNumId w:val="19"/>
+    <w:abstractNumId w:val="24"/>
   </w:num>
   <w:num w:numId="3" w16cid:durableId="1213810549">
-    <w:abstractNumId w:val="20"/>
+    <w:abstractNumId w:val="25"/>
   </w:num>
   <w:num w:numId="4" w16cid:durableId="939263446">
-    <w:abstractNumId w:val="14"/>
+    <w:abstractNumId w:val="18"/>
   </w:num>
   <w:num w:numId="5" w16cid:durableId="654188905">
     <w:abstractNumId w:val="0"/>
   </w:num>
   <w:num w:numId="6" w16cid:durableId="1761482426">
-    <w:abstractNumId w:val="23"/>
+    <w:abstractNumId w:val="28"/>
   </w:num>
   <w:num w:numId="7" w16cid:durableId="478617618">
-    <w:abstractNumId w:val="5"/>
+    <w:abstractNumId w:val="8"/>
   </w:num>
   <w:num w:numId="8" w16cid:durableId="954822509">
-    <w:abstractNumId w:val="22"/>
+    <w:abstractNumId w:val="27"/>
   </w:num>
   <w:num w:numId="9" w16cid:durableId="848527144">
-    <w:abstractNumId w:val="11"/>
+    <w:abstractNumId w:val="15"/>
   </w:num>
   <w:num w:numId="10" w16cid:durableId="1858688844">
     <w:abstractNumId w:val="1"/>
   </w:num>
   <w:num w:numId="11" w16cid:durableId="128910773">
+    <w:abstractNumId w:val="17"/>
+  </w:num>
+  <w:num w:numId="12" w16cid:durableId="664632936">
+    <w:abstractNumId w:val="12"/>
+  </w:num>
+  <w:num w:numId="13" w16cid:durableId="1257207914">
+    <w:abstractNumId w:val="9"/>
+  </w:num>
+  <w:num w:numId="14" w16cid:durableId="1130637079">
+    <w:abstractNumId w:val="26"/>
+  </w:num>
+  <w:num w:numId="15" w16cid:durableId="1896315599">
+    <w:abstractNumId w:val="21"/>
+  </w:num>
+  <w:num w:numId="16" w16cid:durableId="1211840911">
+    <w:abstractNumId w:val="11"/>
+  </w:num>
+  <w:num w:numId="17" w16cid:durableId="1320421257">
+    <w:abstractNumId w:val="22"/>
+  </w:num>
+  <w:num w:numId="18" w16cid:durableId="17703582">
+    <w:abstractNumId w:val="16"/>
+  </w:num>
+  <w:num w:numId="19" w16cid:durableId="1649818434">
+    <w:abstractNumId w:val="19"/>
+  </w:num>
+  <w:num w:numId="20" w16cid:durableId="2048525092">
+    <w:abstractNumId w:val="7"/>
+  </w:num>
+  <w:num w:numId="21" w16cid:durableId="73550962">
+    <w:abstractNumId w:val="14"/>
+  </w:num>
+  <w:num w:numId="22" w16cid:durableId="444662156">
+    <w:abstractNumId w:val="4"/>
+  </w:num>
+  <w:num w:numId="23" w16cid:durableId="1034498578">
+    <w:abstractNumId w:val="3"/>
+  </w:num>
+  <w:num w:numId="24" w16cid:durableId="1974942453">
+    <w:abstractNumId w:val="10"/>
+  </w:num>
+  <w:num w:numId="25" w16cid:durableId="454562470">
+    <w:abstractNumId w:val="6"/>
+  </w:num>
+  <w:num w:numId="26" w16cid:durableId="1867714205">
+    <w:abstractNumId w:val="5"/>
+  </w:num>
+  <w:num w:numId="27" w16cid:durableId="1847476655">
+    <w:abstractNumId w:val="29"/>
+  </w:num>
+  <w:num w:numId="28" w16cid:durableId="2120292365">
+    <w:abstractNumId w:val="2"/>
+  </w:num>
+  <w:num w:numId="29" w16cid:durableId="1321542390">
+    <w:abstractNumId w:val="20"/>
+  </w:num>
+  <w:num w:numId="30" w16cid:durableId="1517501752">
     <w:abstractNumId w:val="13"/>
   </w:num>
-  <w:num w:numId="12" w16cid:durableId="664632936">
-    <w:abstractNumId w:val="9"/>
-  </w:num>
-  <w:num w:numId="13" w16cid:durableId="1257207914">
-    <w:abstractNumId w:val="6"/>
-  </w:num>
-  <w:num w:numId="14" w16cid:durableId="1130637079">
-    <w:abstractNumId w:val="21"/>
-  </w:num>
-  <w:num w:numId="15" w16cid:durableId="1896315599">
-    <w:abstractNumId w:val="16"/>
-  </w:num>
-  <w:num w:numId="16" w16cid:durableId="1211840911">
-    <w:abstractNumId w:val="8"/>
-  </w:num>
-  <w:num w:numId="17" w16cid:durableId="1320421257">
-    <w:abstractNumId w:val="17"/>
-  </w:num>
-  <w:num w:numId="18" w16cid:durableId="17703582">
-    <w:abstractNumId w:val="12"/>
-  </w:num>
-  <w:num w:numId="19" w16cid:durableId="1649818434">
-    <w:abstractNumId w:val="15"/>
-  </w:num>
-  <w:num w:numId="20" w16cid:durableId="2048525092">
-    <w:abstractNumId w:val="4"/>
-  </w:num>
-  <w:num w:numId="21" w16cid:durableId="73550962">
-    <w:abstractNumId w:val="10"/>
-  </w:num>
-  <w:num w:numId="22" w16cid:durableId="444662156">
-    <w:abstractNumId w:val="3"/>
-  </w:num>
-  <w:num w:numId="23" w16cid:durableId="1034498578">
-    <w:abstractNumId w:val="2"/>
-  </w:num>
-  <w:num w:numId="24" w16cid:durableId="1974942453">
-    <w:abstractNumId w:val="7"/>
-  </w:num>
 </w:numbering>
+</file>
+
+<file path=word/people.xml><?xml version="1.0" encoding="utf-8"?>
+<w15:people xmlns:wpc="http://schemas.microsoft.com/office/word/2010/wordprocessingCanvas" xmlns:cx="http://schemas.microsoft.com/office/drawing/2014/chartex" xmlns:cx1="http://schemas.microsoft.com/office/drawing/2015/9/8/chartex" xmlns:cx2="http://schemas.microsoft.com/office/drawing/2015/10/21/chartex" xmlns:cx3="http://schemas.microsoft.com/office/drawing/2016/5/9/chartex" xmlns:cx4="http://schemas.microsoft.com/office/drawing/2016/5/10/chartex" xmlns:cx5="http://schemas.microsoft.com/office/drawing/2016/5/11/chartex" xmlns:cx6="http://schemas.microsoft.com/office/drawing/2016/5/12/chartex" xmlns:cx7="http://schemas.microsoft.com/office/drawing/2016/5/13/chartex" xmlns:cx8="http://schemas.microsoft.com/office/drawing/2016/5/14/chartex" xmlns:mc="http://schemas.openxmlformats.org/markup-compatibility/2006" xmlns:aink="http://schemas.microsoft.com/office/drawing/2016/ink" xmlns:am3d="http://schemas.microsoft.com/office/drawing/2017/model3d" xmlns:o="urn:schemas-microsoft-com:office:office" xmlns:oel="http://schemas.microsoft.com/office/2019/extlst" xmlns:r="http://schemas.openxmlformats.org/officeDocument/2006/relationships" xmlns:m="http://schemas.openxmlformats.org/officeDocument/2006/math" xmlns:v="urn:schemas-microsoft-com:vml" xmlns:wp14="http://schemas.microsoft.com/office/word/2010/wordprocessingDrawing" xmlns:wp="http://schemas.openxmlformats.org/drawingml/2006/wordprocessingDrawing" xmlns:w10="urn:schemas-microsoft-com:office:word" xmlns:w="http://schemas.openxmlformats.org/wordprocessingml/2006/main" xmlns:w14="http://schemas.microsoft.com/office/word/2010/wordml" xmlns:w15="http://schemas.microsoft.com/office/word/2012/wordml" xmlns:w16cex="http://schemas.microsoft.com/office/word/2018/wordml/cex" xmlns:w16cid="http://schemas.microsoft.com/office/word/2016/wordml/cid" xmlns:w16="http://schemas.microsoft.com/office/word/2018/wordml" xmlns:w16du="http://schemas.microsoft.com/office/word/2023/wordml/word16du" xmlns:w16sdtdh="http://schemas.microsoft.com/office/word/2020/wordml/sdtdatahash" xmlns:w16sdtfl="http://schemas.microsoft.com/office/word/2024/wordml/sdtformatlock" xmlns:w16se="http://schemas.microsoft.com/office/word/2015/wordml/symex" xmlns:wpg="http://schemas.microsoft.com/office/word/2010/wordprocessingGroup" xmlns:wpi="http://schemas.microsoft.com/office/word/2010/wordprocessingInk" xmlns:wne="http://schemas.microsoft.com/office/word/2006/wordml" xmlns:wps="http://schemas.microsoft.com/office/word/2010/wordprocessingShape" mc:Ignorable="w14 w15 w16se w16cid w16 w16cex w16sdtdh w16sdtfl w16du wp14">
+  <w15:person w15:author="Renato Astargo">
+    <w15:presenceInfo w15:providerId="Windows Live" w15:userId="34e515f99866ef61"/>
+  </w15:person>
+</w15:people>
 </file>
 
 <file path=word/styles.xml><?xml version="1.0" encoding="utf-8"?>
@@ -7088,7 +8268,6 @@
     <w:next w:val="Normal"/>
     <w:link w:val="Ttulo4Car"/>
     <w:uiPriority w:val="9"/>
-    <w:semiHidden/>
     <w:unhideWhenUsed/>
     <w:qFormat/>
     <w:rsid w:val="00851BB0"/>
@@ -7284,7 +8463,6 @@
     <w:basedOn w:val="Fuentedeprrafopredeter"/>
     <w:link w:val="Ttulo4"/>
     <w:uiPriority w:val="9"/>
-    <w:semiHidden/>
     <w:rsid w:val="00851BB0"/>
     <w:rPr>
       <w:rFonts w:eastAsiaTheme="majorEastAsia" w:cstheme="majorBidi"/>
@@ -7776,6 +8954,72 @@
       <w:szCs w:val="26"/>
     </w:rPr>
   </w:style>
+  <w:style w:type="character" w:styleId="Refdecomentario">
+    <w:name w:val="annotation reference"/>
+    <w:basedOn w:val="Fuentedeprrafopredeter"/>
+    <w:uiPriority w:val="99"/>
+    <w:semiHidden/>
+    <w:unhideWhenUsed/>
+    <w:rsid w:val="00F77F33"/>
+    <w:rPr>
+      <w:sz w:val="16"/>
+      <w:szCs w:val="16"/>
+    </w:rPr>
+  </w:style>
+  <w:style w:type="paragraph" w:styleId="Textocomentario">
+    <w:name w:val="annotation text"/>
+    <w:basedOn w:val="Normal"/>
+    <w:link w:val="TextocomentarioCar"/>
+    <w:uiPriority w:val="99"/>
+    <w:unhideWhenUsed/>
+    <w:rsid w:val="00F77F33"/>
+    <w:pPr>
+      <w:spacing w:line="240" w:lineRule="auto"/>
+    </w:pPr>
+    <w:rPr>
+      <w:sz w:val="20"/>
+      <w:szCs w:val="20"/>
+    </w:rPr>
+  </w:style>
+  <w:style w:type="character" w:customStyle="1" w:styleId="TextocomentarioCar">
+    <w:name w:val="Texto comentario Car"/>
+    <w:basedOn w:val="Fuentedeprrafopredeter"/>
+    <w:link w:val="Textocomentario"/>
+    <w:uiPriority w:val="99"/>
+    <w:rsid w:val="00F77F33"/>
+    <w:rPr>
+      <w:sz w:val="20"/>
+      <w:szCs w:val="20"/>
+    </w:rPr>
+  </w:style>
+  <w:style w:type="paragraph" w:styleId="Asuntodelcomentario">
+    <w:name w:val="annotation subject"/>
+    <w:basedOn w:val="Textocomentario"/>
+    <w:next w:val="Textocomentario"/>
+    <w:link w:val="AsuntodelcomentarioCar"/>
+    <w:uiPriority w:val="99"/>
+    <w:semiHidden/>
+    <w:unhideWhenUsed/>
+    <w:rsid w:val="00F77F33"/>
+    <w:rPr>
+      <w:b/>
+      <w:bCs/>
+    </w:rPr>
+  </w:style>
+  <w:style w:type="character" w:customStyle="1" w:styleId="AsuntodelcomentarioCar">
+    <w:name w:val="Asunto del comentario Car"/>
+    <w:basedOn w:val="TextocomentarioCar"/>
+    <w:link w:val="Asuntodelcomentario"/>
+    <w:uiPriority w:val="99"/>
+    <w:semiHidden/>
+    <w:rsid w:val="00F77F33"/>
+    <w:rPr>
+      <w:b/>
+      <w:bCs/>
+      <w:sz w:val="20"/>
+      <w:szCs w:val="20"/>
+    </w:rPr>
+  </w:style>
 </w:styles>
 </file>
 

</xml_diff>